<commit_message>
docs(patents): update disclosures, add review replies and figure scripts
- patent_02: refine disclosure, add reply notes and submission files
- patent_04: regenerate fig_4 with gen script, update disclosure
- patent_05: add application and review-comment files
- update skills, CLAUDE.md, README, gitignore; add requirements/setup
</commit_message>
<xml_diff>
--- a/patents/submissions/一种无真值标注条件下的蒙皮质量自动评估、异常筛选与数据闭环构建方法、系统及存储介质.docx
+++ b/patents/submissions/一种无真值标注条件下的蒙皮质量自动评估、异常筛选与数据闭环构建方法、系统及存储介质.docx
@@ -272,14 +272,6 @@
                 <w:szCs w:val="18"/>
               </w:rPr>
             </w:pPr>
-            <w:r>
-              <w:rPr>
-                <w:rFonts w:ascii="微软雅黑" w:eastAsia="微软雅黑" w:hAnsi="微软雅黑"/>
-                <w:sz w:val="18"/>
-                <w:szCs w:val="18"/>
-              </w:rPr>
-              <w:t xml:space="preserve">汪金奕</w:t>
-            </w:r>
           </w:p>
         </w:tc>
         <w:tc>
@@ -361,7 +353,7 @@
                 <w:sz w:val="18"/>
                 <w:szCs w:val="18"/>
               </w:rPr>
-              <w:t xml:space="preserve">三维角色动画蒙皮质量评估</w:t>
+              <w:t xml:space="preserve">蒙皮质量自动评估、异常筛选与数据闭环构建技术</w:t>
             </w:r>
           </w:p>
         </w:tc>
@@ -504,14 +496,6 @@
                 <w:szCs w:val="18"/>
               </w:rPr>
             </w:pPr>
-            <w:r>
-              <w:rPr>
-                <w:rFonts w:ascii="微软雅黑" w:eastAsia="微软雅黑" w:hAnsi="微软雅黑"/>
-                <w:sz w:val="18"/>
-                <w:szCs w:val="18"/>
-              </w:rPr>
-              <w:t xml:space="preserve">andyjywang@tencent.com</w:t>
-            </w:r>
           </w:p>
         </w:tc>
       </w:tr>
@@ -2696,18 +2680,8 @@
           <w:sz w:val="18"/>
           <w:szCs w:val="18"/>
         </w:rPr>
-        <w:t xml:space="preserve">本发明欲保护的技术关键点包括以下六个协同层次：</w:t>
-      </w:r>
-    </w:p>
-    <w:p>
-      <w:pPr>
-        <w:spacing w:line="276" w:lineRule="auto"/>
-        <w:rPr>
-          <w:rFonts w:ascii="微软雅黑" w:eastAsia="微软雅黑" w:hAnsi="微软雅黑"/>
-          <w:sz w:val="18"/>
-          <w:szCs w:val="18"/>
-        </w:rPr>
-      </w:pPr>
+        <w:t xml:space="preserve">需要说明的是，本发明中的"训练联动"所联动的是</w:t>
+      </w:r>
       <w:r>
         <w:rPr>
           <w:rFonts w:ascii="微软雅黑" w:eastAsia="微软雅黑" w:hAnsi="微软雅黑"/>
@@ -2716,7 +2690,15 @@
           <w:b/>
           <w:bCs/>
         </w:rPr>
-        <w:t xml:space="preserve">关键点一：无GT多指标评估框架</w:t>
+        <w:t xml:space="preserve">自动蒙皮模型</w:t>
+      </w:r>
+      <w:r>
+        <w:rPr>
+          <w:rFonts w:ascii="微软雅黑" w:eastAsia="微软雅黑" w:hAnsi="微软雅黑"/>
+          <w:sz w:val="18"/>
+          <w:szCs w:val="18"/>
+        </w:rPr>
+        <w:t xml:space="preserve">（即输入角色网格与骨骼、输出顶点蒙皮权重的AI模型，例如基于深度网络的自动绑定/自动刷权重模型）。本发明并不直接训练一个"评估蒙皮质量的AI模型"，而是用本发明所述的无GT物理规则评估引擎为蒙皮模型的输出做质量打分，再把打分结果（剔除低质样本、对中等样本降权、把高频异常归档为难例）反馈到该蒙皮模型的训练数据与损失调制中，从而驱动该蒙皮模型迭代提升。即：评估引擎的输入是蒙皮模型的输出（顶点序列、骨骼变换、权重矩阵），评估引擎的输出是质量分数与处理动作，二者共同构成对蒙皮模型的闭环反馈。</w:t>
       </w:r>
     </w:p>
     <w:p>
@@ -2735,7 +2717,7 @@
           <w:sz w:val="18"/>
           <w:szCs w:val="18"/>
         </w:rPr>
-        <w:t xml:space="preserve">在无人工标注前提下，从几何（共线、形变）、拓扑（穿插、粘连）、运动学（速度连续性）和能量一致性（局部应变、边界抖动）多个维度构建可计算指标体系，对蒙皮结果进行多维度自动质量评分。各指标基于物理/几何规则推导，具备明确的数学定义与工程可实施性。</w:t>
+        <w:t xml:space="preserve">本发明欲保护的技术关键点包括以下六个协同层次：</w:t>
       </w:r>
     </w:p>
     <w:p>
@@ -2755,7 +2737,7 @@
           <w:b/>
           <w:bCs/>
         </w:rPr>
-        <w:t xml:space="preserve">关键点二：插件化指标架构</w:t>
+        <w:t xml:space="preserve">关键点一：无GT多指标评估框架</w:t>
       </w:r>
     </w:p>
     <w:p>
@@ -2774,7 +2756,7 @@
           <w:sz w:val="18"/>
           <w:szCs w:val="18"/>
         </w:rPr>
-        <w:t xml:space="preserve">将各类指标设计为独立计算插件，插件间无强依赖，支持按项目需求启停、调整计算顺序、配置权重与版本，并允许新增指标而不影响已有流程稳定性。该架构使评估体系具备持续扩展能力。</w:t>
+        <w:t xml:space="preserve">在无人工标注前提下，从几何（共线、形变）、拓扑（穿插、粘连）、运动学（速度连续性）和能量一致性（局部应变、边界抖动）多个维度构建可计算指标体系，对蒙皮结果进行多维度自动质量评分。各指标基于物理/几何规则推导，具备明确的数学定义与工程可实施性。</w:t>
       </w:r>
     </w:p>
     <w:p>
@@ -2794,7 +2776,7 @@
           <w:b/>
           <w:bCs/>
         </w:rPr>
-        <w:t xml:space="preserve">关键点三：自适应阈值与多策略聚合</w:t>
+        <w:t xml:space="preserve">关键点二：插件化指标架构</w:t>
       </w:r>
     </w:p>
     <w:p>
@@ -2813,7 +2795,7 @@
           <w:sz w:val="18"/>
           <w:szCs w:val="18"/>
         </w:rPr>
-        <w:t xml:space="preserve">阈值策略支持固定阈值、分位数阈值和按部位自适应阈值三种模式，使阈值能够随数据分布自动适配不同角色类型、服装类别和动作范围。多指标聚合采用加权求和与门控惩罚相结合的机制，关键指标超强阈值时触发额外惩罚，防止总分掩盖局部严重异常。</w:t>
+        <w:t xml:space="preserve">将各类指标设计为独立计算插件，插件间无强依赖，支持按项目需求启停、调整计算顺序、配置权重与版本，并允许新增指标而不影响已有流程稳定性。该架构使评估体系具备持续扩展能力。</w:t>
       </w:r>
     </w:p>
     <w:p>
@@ -2833,7 +2815,7 @@
           <w:b/>
           <w:bCs/>
         </w:rPr>
-        <w:t xml:space="preserve">关键点四：异常定位与可解释报告</w:t>
+        <w:t xml:space="preserve">关键点三：自适应阈值与多策略聚合</w:t>
       </w:r>
     </w:p>
     <w:p>
@@ -2852,7 +2834,7 @@
           <w:sz w:val="18"/>
           <w:szCs w:val="18"/>
         </w:rPr>
-        <w:t xml:space="preserve">评估结果支持从样本级分数下钻至顶点/边/面/骨骼影响域的细粒度定位，通过连通域聚类输出区域级定位结果，同时生成异常类型、严重度、触发规则路径和建议处理动作的可解释报告，便于美术和工程快速复查与定向修复。</w:t>
+        <w:t xml:space="preserve">阈值策略支持固定阈值、分位数阈值和按部位自适应阈值三种模式，使阈值能够随数据分布自动适配不同角色类型、服装类别和动作范围。多指标聚合采用加权求和与门控惩罚相结合的机制，关键指标超强阈值时触发额外惩罚，防止总分掩盖局部严重异常。</w:t>
       </w:r>
     </w:p>
     <w:p>
@@ -2872,7 +2854,7 @@
           <w:b/>
           <w:bCs/>
         </w:rPr>
-        <w:t xml:space="preserve">关键点五：数据闭环联动执行</w:t>
+        <w:t xml:space="preserve">关键点四：异常定位与可解释报告</w:t>
       </w:r>
     </w:p>
     <w:p>
@@ -2891,7 +2873,7 @@
           <w:sz w:val="18"/>
           <w:szCs w:val="18"/>
         </w:rPr>
-        <w:t xml:space="preserve">按异常评级自动执行样本路由（保留/剔除/降权/重采样）与训练联动（难例入库、定向微调触发、损失调制），将质量评估结果直接转化为训练数据优化动作，形成评估—训练—评估的持续改进闭环。</w:t>
+        <w:t xml:space="preserve">评估结果支持从样本级分数下钻至顶点/边/面/骨骼影响域的细粒度定位，通过连通域聚类输出区域级定位结果，同时生成异常类型、严重度、触发规则路径和建议处理动作的可解释报告，便于美术和工程快速复查与定向修复。</w:t>
       </w:r>
     </w:p>
     <w:p>
@@ -2911,6 +2893,45 @@
           <w:b/>
           <w:bCs/>
         </w:rPr>
+        <w:t xml:space="preserve">关键点五：数据闭环联动执行</w:t>
+      </w:r>
+    </w:p>
+    <w:p>
+      <w:pPr>
+        <w:spacing w:line="276" w:lineRule="auto"/>
+        <w:rPr>
+          <w:rFonts w:ascii="微软雅黑" w:eastAsia="微软雅黑" w:hAnsi="微软雅黑"/>
+          <w:sz w:val="18"/>
+          <w:szCs w:val="18"/>
+        </w:rPr>
+        <w:ind w:firstLineChars="200" w:firstLine="420"/>
+      </w:pPr>
+      <w:r>
+        <w:rPr>
+          <w:rFonts w:ascii="微软雅黑" w:eastAsia="微软雅黑" w:hAnsi="微软雅黑"/>
+          <w:sz w:val="18"/>
+          <w:szCs w:val="18"/>
+        </w:rPr>
+        <w:t xml:space="preserve">按异常评级自动执行样本路由（保留/剔除/降权/重采样）与训练联动（难例入库、定向微调触发、损失调制），将质量评估结果直接转化为训练数据优化动作，形成评估—训练—评估的持续改进闭环。其中"重采样"指对该样本所属类别（如某类异常动作）调整其在训练批次中被抽取的概率或重复次数（过采样难例、欠采样冗余正常样本），而非对样本本身做几何修复；几何层面的修复由下游后处理算子另行承担。</w:t>
+      </w:r>
+    </w:p>
+    <w:p>
+      <w:pPr>
+        <w:spacing w:line="276" w:lineRule="auto"/>
+        <w:rPr>
+          <w:rFonts w:ascii="微软雅黑" w:eastAsia="微软雅黑" w:hAnsi="微软雅黑"/>
+          <w:sz w:val="18"/>
+          <w:szCs w:val="18"/>
+        </w:rPr>
+      </w:pPr>
+      <w:r>
+        <w:rPr>
+          <w:rFonts w:ascii="微软雅黑" w:eastAsia="微软雅黑" w:hAnsi="微软雅黑"/>
+          <w:sz w:val="18"/>
+          <w:szCs w:val="18"/>
+          <w:b/>
+          <w:bCs/>
+        </w:rPr>
         <w:t xml:space="preserve">关键点六：质量闸门化部署与版本回归</w:t>
       </w:r>
     </w:p>
@@ -2930,7 +2951,79 @@
           <w:sz w:val="18"/>
           <w:szCs w:val="18"/>
         </w:rPr>
-        <w:t xml:space="preserve">将评估机制部署为三类标准闸门（资产入库闸门、训练数据闸门、模型发布闸门），并通过版本回归机制持续监控关键指标趋势，一旦新版本指标退化超过阈值，自动阻断发布或触发回滚，实现对生产质量的系统性保障。</w:t>
+        <w:t xml:space="preserve">将评估机制部署为三类标准闸门（资产入库闸门、训练数据闸门、模型发布闸门），即在资产入库、训练数据入集、模型发布这三个环节分别设置对应的自动校验卡口；并通过版本回归机制持续监控关键指标趋势，一旦新版本指标退化超过阈值，自动阻断发布或触发回滚，实现对生产质量的系统性保障。此处"关键指标"指在配置中被标记为 `is_critical` 的若干高优先级指标，典型为穿插指标 </w:t>
+      </w:r>
+      <m:oMath>
+        <m:box>
+          <m:e>
+            <m:sSub>
+              <m:e>
+                <m:r>
+                  <m:rPr>
+                    <m:sty m:val="i"/>
+                  </m:rPr>
+                  <m:t>m</m:t>
+                </m:r>
+              </m:e>
+              <m:sub>
+                <m:box>
+                  <m:e>
+                    <m:r>
+                      <m:rPr>
+                        <m:nor/>
+                      </m:rPr>
+                      <m:t>pen</m:t>
+                    </m:r>
+                  </m:e>
+                </m:box>
+              </m:sub>
+            </m:sSub>
+          </m:e>
+        </m:box>
+      </m:oMath>
+      <w:r>
+        <w:rPr>
+          <w:rFonts w:ascii="微软雅黑" w:eastAsia="微软雅黑" w:hAnsi="微软雅黑"/>
+          <w:sz w:val="18"/>
+          <w:szCs w:val="18"/>
+        </w:rPr>
+        <w:t xml:space="preserve"> 与共线/翻折指标 </w:t>
+      </w:r>
+      <m:oMath>
+        <m:box>
+          <m:e>
+            <m:sSub>
+              <m:e>
+                <m:r>
+                  <m:rPr>
+                    <m:sty m:val="i"/>
+                  </m:rPr>
+                  <m:t>m</m:t>
+                </m:r>
+              </m:e>
+              <m:sub>
+                <m:box>
+                  <m:e>
+                    <m:r>
+                      <m:rPr>
+                        <m:nor/>
+                      </m:rPr>
+                      <m:t>col</m:t>
+                    </m:r>
+                  </m:e>
+                </m:box>
+              </m:sub>
+            </m:sSub>
+          </m:e>
+        </m:box>
+      </m:oMath>
+      <w:r>
+        <w:rPr>
+          <w:rFonts w:ascii="微软雅黑" w:eastAsia="微软雅黑" w:hAnsi="微软雅黑"/>
+          <w:sz w:val="18"/>
+          <w:szCs w:val="18"/>
+        </w:rPr>
+        <w:t xml:space="preserve">（即一旦严重即不可接受的硬性缺陷指标），具体集合可按项目配置。</w:t>
       </w:r>
     </w:p>
     <w:p>
@@ -3751,201 +3844,6 @@
           <w:szCs w:val="18"/>
         </w:rPr>
         <w:t xml:space="preserve">产品侧实现为"无GT质量评估与闭环平台"，可嵌入现有动画生产工具链或训练管线，主要功能模块如下：</w:t>
-      </w:r>
-    </w:p>
-    <w:p>
-      <w:pPr>
-        <w:spacing w:line="276" w:lineRule="auto"/>
-        <w:rPr>
-          <w:rFonts w:ascii="微软雅黑" w:eastAsia="微软雅黑" w:hAnsi="微软雅黑"/>
-          <w:sz w:val="18"/>
-          <w:szCs w:val="18"/>
-        </w:rPr>
-      </w:pPr>
-      <w:r>
-        <w:rPr>
-          <w:rFonts w:ascii="微软雅黑" w:eastAsia="微软雅黑" w:hAnsi="微软雅黑"/>
-          <w:sz w:val="18"/>
-          <w:szCs w:val="18"/>
-          <w:b/>
-          <w:bCs/>
-        </w:rPr>
-        <w:t xml:space="preserve">数据接入与指标编排层</w:t>
-      </w:r>
-      <w:r>
-        <w:rPr>
-          <w:rFonts w:ascii="微软雅黑" w:eastAsia="微软雅黑" w:hAnsi="微软雅黑"/>
-          <w:sz w:val="18"/>
-          <w:szCs w:val="18"/>
-        </w:rPr>
-        <w:t xml:space="preserve"> ：接入单帧或序列蒙皮结果（顶点序列、骨骼变换、权重矩阵）及网格拓扑、部位分组等结构信息；以插件化方式管理指标集合，支持按项目模板启停指标，配置权重、阈值与优先级。</w:t>
-      </w:r>
-    </w:p>
-    <w:p>
-      <w:pPr>
-        <w:spacing w:line="276" w:lineRule="auto"/>
-        <w:rPr>
-          <w:rFonts w:ascii="微软雅黑" w:eastAsia="微软雅黑" w:hAnsi="微软雅黑"/>
-          <w:sz w:val="18"/>
-          <w:szCs w:val="18"/>
-        </w:rPr>
-      </w:pPr>
-      <w:r>
-        <w:rPr>
-          <w:rFonts w:ascii="微软雅黑" w:eastAsia="微软雅黑" w:hAnsi="微软雅黑"/>
-          <w:sz w:val="18"/>
-          <w:szCs w:val="18"/>
-          <w:b/>
-          <w:bCs/>
-        </w:rPr>
-        <w:t xml:space="preserve">评估执行与决策层</w:t>
-      </w:r>
-      <w:r>
-        <w:rPr>
-          <w:rFonts w:ascii="微软雅黑" w:eastAsia="微软雅黑" w:hAnsi="微软雅黑"/>
-          <w:sz w:val="18"/>
-          <w:szCs w:val="18"/>
-        </w:rPr>
-        <w:t xml:space="preserve"> ：批量并行运行指标插件，输出样本总分 </w:t>
-      </w:r>
-      <m:oMath>
-        <m:box>
-          <m:e>
-            <m:r>
-              <m:rPr>
-                <m:sty m:val="i"/>
-              </m:rPr>
-              <m:t>Q</m:t>
-            </m:r>
-          </m:e>
-        </m:box>
-      </m:oMath>
-      <w:r>
-        <w:rPr>
-          <w:rFonts w:ascii="微软雅黑" w:eastAsia="微软雅黑" w:hAnsi="微软雅黑"/>
-          <w:sz w:val="18"/>
-          <w:szCs w:val="18"/>
-        </w:rPr>
-        <w:t xml:space="preserve">、分项分数 </w:t>
-      </w:r>
-      <m:oMath>
-        <m:box>
-          <m:e>
-            <m:r>
-              <m:rPr>
-                <m:sty m:val="p"/>
-              </m:rPr>
-              <m:t>{</m:t>
-            </m:r>
-            <m:sSub>
-              <m:e>
-                <m:r>
-                  <m:rPr>
-                    <m:sty m:val="i"/>
-                  </m:rPr>
-                  <m:t>s</m:t>
-                </m:r>
-              </m:e>
-              <m:sub>
-                <m:r>
-                  <m:rPr>
-                    <m:sty m:val="i"/>
-                  </m:rPr>
-                  <m:t>i</m:t>
-                </m:r>
-              </m:sub>
-            </m:sSub>
-            <m:r>
-              <m:rPr>
-                <m:sty m:val="p"/>
-              </m:rPr>
-              <m:t>}</m:t>
-            </m:r>
-          </m:e>
-        </m:box>
-      </m:oMath>
-      <w:r>
-        <w:rPr>
-          <w:rFonts w:ascii="微软雅黑" w:eastAsia="微软雅黑" w:hAnsi="微软雅黑"/>
-          <w:sz w:val="18"/>
-          <w:szCs w:val="18"/>
-        </w:rPr>
-        <w:t xml:space="preserve"> 和定位区域；依据分级策略自动划分A/B/C质量等级，执行保留、降权、重采样或剔除动作，对资产入库、训练数据构建、模型发布三类场景提供标准闸门接口。</w:t>
-      </w:r>
-    </w:p>
-    <w:p>
-      <w:pPr>
-        <w:spacing w:line="276" w:lineRule="auto"/>
-        <w:rPr>
-          <w:rFonts w:ascii="微软雅黑" w:eastAsia="微软雅黑" w:hAnsi="微软雅黑"/>
-          <w:sz w:val="18"/>
-          <w:szCs w:val="18"/>
-        </w:rPr>
-      </w:pPr>
-      <w:r>
-        <w:rPr>
-          <w:rFonts w:ascii="微软雅黑" w:eastAsia="微软雅黑" w:hAnsi="微软雅黑"/>
-          <w:sz w:val="18"/>
-          <w:szCs w:val="18"/>
-          <w:b/>
-          <w:bCs/>
-        </w:rPr>
-        <w:t xml:space="preserve">闭环联动层</w:t>
-      </w:r>
-      <w:r>
-        <w:rPr>
-          <w:rFonts w:ascii="微软雅黑" w:eastAsia="微软雅黑" w:hAnsi="微软雅黑"/>
-          <w:sz w:val="18"/>
-          <w:szCs w:val="18"/>
-        </w:rPr>
-        <w:t xml:space="preserve"> ：将异常样本归档至难例池，按配置周期触发微调与回归任务；将回归结果中的阈值优化建议反写至配置层，形成评估策略的持续自适应更新。</w:t>
-      </w:r>
-    </w:p>
-    <w:p>
-      <w:pPr>
-        <w:spacing w:line="276" w:lineRule="auto"/>
-        <w:rPr>
-          <w:rFonts w:ascii="微软雅黑" w:eastAsia="微软雅黑" w:hAnsi="微软雅黑"/>
-          <w:sz w:val="18"/>
-          <w:szCs w:val="18"/>
-        </w:rPr>
-      </w:pPr>
-      <w:r>
-        <w:rPr>
-          <w:rFonts w:ascii="微软雅黑" w:eastAsia="微软雅黑" w:hAnsi="微软雅黑"/>
-          <w:sz w:val="18"/>
-          <w:szCs w:val="18"/>
-          <w:b/>
-          <w:bCs/>
-        </w:rPr>
-        <w:t xml:space="preserve">可视化与审计层</w:t>
-      </w:r>
-      <w:r>
-        <w:rPr>
-          <w:rFonts w:ascii="微软雅黑" w:eastAsia="微软雅黑" w:hAnsi="微软雅黑"/>
-          <w:sz w:val="18"/>
-          <w:szCs w:val="18"/>
-        </w:rPr>
-        <w:t xml:space="preserve"> ：提供指标趋势图、异常热区图和误判抽检报告，保留规则版本、阈值版本、执行日志与报告快照，支持完整审计追溯。</w:t>
-      </w:r>
-    </w:p>
-    <w:p>
-      <w:pPr>
-        <w:spacing w:line="276" w:lineRule="auto"/>
-        <w:rPr>
-          <w:rFonts w:ascii="微软雅黑" w:eastAsia="微软雅黑" w:hAnsi="微软雅黑"/>
-          <w:sz w:val="18"/>
-          <w:szCs w:val="18"/>
-        </w:rPr>
-        <w:ind w:firstLineChars="200" w:firstLine="420"/>
-      </w:pPr>
-      <w:r>
-        <w:rPr>
-          <w:rFonts w:ascii="微软雅黑" w:eastAsia="微软雅黑" w:hAnsi="微软雅黑"/>
-          <w:sz w:val="18"/>
-          <w:szCs w:val="18"/>
-        </w:rPr>
-        <w:t xml:space="preserve">典型业务流程：每日批任务执行全量评估并划分A/B/C等级；C级剔除，B级人工抽检，A级直接入训练集；周期触发难例微调与对照回归；若关键指标恶化超过阈值，自动阻断发布或回滚配置。</w:t>
       </w:r>
     </w:p>
     <w:p>
@@ -3999,7 +3897,310 @@
           <w:sz w:val="18"/>
           <w:szCs w:val="18"/>
         </w:rPr>
-        <w:t>图1 无GT质量评估与闭环平台系统架构图</w:t>
+        <w:t>图1 无真值蒙皮质量自动评估与数据闭环系统总体架构图</w:t>
+      </w:r>
+    </w:p>
+    <w:p>
+      <w:pPr>
+        <w:spacing w:line="276" w:lineRule="auto"/>
+        <w:rPr>
+          <w:rFonts w:ascii="微软雅黑" w:eastAsia="微软雅黑" w:hAnsi="微软雅黑"/>
+          <w:sz w:val="18"/>
+          <w:szCs w:val="18"/>
+        </w:rPr>
+      </w:pPr>
+      <w:r>
+        <w:rPr>
+          <w:rFonts w:ascii="微软雅黑" w:eastAsia="微软雅黑" w:hAnsi="微软雅黑"/>
+          <w:sz w:val="18"/>
+          <w:szCs w:val="18"/>
+          <w:b/>
+          <w:bCs/>
+        </w:rPr>
+        <w:t xml:space="preserve">数据接入与指标编排层</w:t>
+      </w:r>
+      <w:r>
+        <w:rPr>
+          <w:rFonts w:ascii="微软雅黑" w:eastAsia="微软雅黑" w:hAnsi="微软雅黑"/>
+          <w:sz w:val="18"/>
+          <w:szCs w:val="18"/>
+        </w:rPr>
+        <w:t xml:space="preserve"> ：接入单帧或序列蒙皮结果（顶点序列、骨骼变换、权重矩阵）及网格拓扑、部位分组等结构信息；以插件化方式管理指标集合，支持按项目模板启停指标，配置权重、阈值与优先级。</w:t>
+      </w:r>
+    </w:p>
+    <w:p>
+      <w:pPr>
+        <w:spacing w:line="276" w:lineRule="auto"/>
+        <w:rPr>
+          <w:rFonts w:ascii="微软雅黑" w:eastAsia="微软雅黑" w:hAnsi="微软雅黑"/>
+          <w:sz w:val="18"/>
+          <w:szCs w:val="18"/>
+        </w:rPr>
+      </w:pPr>
+      <w:r>
+        <w:rPr>
+          <w:rFonts w:ascii="微软雅黑" w:eastAsia="微软雅黑" w:hAnsi="微软雅黑"/>
+          <w:sz w:val="18"/>
+          <w:szCs w:val="18"/>
+          <w:b/>
+          <w:bCs/>
+        </w:rPr>
+        <w:t xml:space="preserve">评估执行与决策层</w:t>
+      </w:r>
+      <w:r>
+        <w:rPr>
+          <w:rFonts w:ascii="微软雅黑" w:eastAsia="微软雅黑" w:hAnsi="微软雅黑"/>
+          <w:sz w:val="18"/>
+          <w:szCs w:val="18"/>
+        </w:rPr>
+        <w:t xml:space="preserve"> ：批量并行运行指标插件，输出样本总分 </w:t>
+      </w:r>
+      <m:oMath>
+        <m:box>
+          <m:e>
+            <m:r>
+              <m:rPr>
+                <m:sty m:val="i"/>
+              </m:rPr>
+              <m:t>Q</m:t>
+            </m:r>
+          </m:e>
+        </m:box>
+      </m:oMath>
+      <w:r>
+        <w:rPr>
+          <w:rFonts w:ascii="微软雅黑" w:eastAsia="微软雅黑" w:hAnsi="微软雅黑"/>
+          <w:sz w:val="18"/>
+          <w:szCs w:val="18"/>
+        </w:rPr>
+        <w:t xml:space="preserve">、分项分数 </w:t>
+      </w:r>
+      <m:oMath>
+        <m:box>
+          <m:e>
+            <m:r>
+              <m:rPr>
+                <m:sty m:val="p"/>
+              </m:rPr>
+              <m:t>{</m:t>
+            </m:r>
+            <m:sSub>
+              <m:e>
+                <m:r>
+                  <m:rPr>
+                    <m:sty m:val="i"/>
+                  </m:rPr>
+                  <m:t>s</m:t>
+                </m:r>
+              </m:e>
+              <m:sub>
+                <m:r>
+                  <m:rPr>
+                    <m:sty m:val="i"/>
+                  </m:rPr>
+                  <m:t>i</m:t>
+                </m:r>
+              </m:sub>
+            </m:sSub>
+            <m:r>
+              <m:rPr>
+                <m:sty m:val="p"/>
+              </m:rPr>
+              <m:t>}</m:t>
+            </m:r>
+          </m:e>
+        </m:box>
+      </m:oMath>
+      <w:r>
+        <w:rPr>
+          <w:rFonts w:ascii="微软雅黑" w:eastAsia="微软雅黑" w:hAnsi="微软雅黑"/>
+          <w:sz w:val="18"/>
+          <w:szCs w:val="18"/>
+        </w:rPr>
+        <w:t xml:space="preserve"> 和定位区域；依据分级策略自动划分A/B/C质量等级，执行保留、降权、重采样或剔除动作，对资产入库、训练数据构建、模型发布三类场景提供标准闸门接口。</w:t>
+      </w:r>
+    </w:p>
+    <w:p>
+      <w:pPr>
+        <w:jc w:val="center"/>
+      </w:pPr>
+      <w:r>
+        <w:drawing>
+          <wp:inline distT="0" distB="0" distL="0" distR="0">
+            <wp:extent cx="4572000" cy="2493818"/>
+            <wp:effectExtent l="0" t="0" r="0" b="0"/>
+            <wp:docPr id="13" name="Picture 13"/>
+            <wp:cNvGraphicFramePr>
+              <a:graphicFrameLocks xmlns:a="http://schemas.openxmlformats.org/drawingml/2006/main" noChangeAspect="1"/>
+            </wp:cNvGraphicFramePr>
+            <a:graphic xmlns:a="http://schemas.openxmlformats.org/drawingml/2006/main">
+              <a:graphicData uri="http://schemas.openxmlformats.org/drawingml/2006/picture">
+                <pic:pic xmlns:pic="http://schemas.openxmlformats.org/drawingml/2006/picture">
+                  <pic:nvPicPr>
+                    <pic:cNvPr id="13" name="image3.png"/>
+                    <pic:cNvPicPr/>
+                  </pic:nvPicPr>
+                  <pic:blipFill>
+                    <a:blip r:embed="rId18"/>
+                    <a:stretch>
+                      <a:fillRect/>
+                    </a:stretch>
+                  </pic:blipFill>
+                  <pic:spPr>
+                    <a:xfrm>
+                      <a:off x="0" y="0"/>
+                      <a:ext cx="4572000" cy="2493818"/>
+                    </a:xfrm>
+                    <a:prstGeom prst="rect">
+                      <a:avLst/>
+                    </a:prstGeom>
+                  </pic:spPr>
+                </pic:pic>
+              </a:graphicData>
+            </a:graphic>
+          </wp:inline>
+        </w:drawing>
+      </w:r>
+    </w:p>
+    <w:p>
+      <w:pPr>
+        <w:jc w:val="center"/>
+      </w:pPr>
+      <w:r>
+        <w:rPr>
+          <w:sz w:val="18"/>
+          <w:szCs w:val="18"/>
+        </w:rPr>
+        <w:t>图2 可插拔多指标评估器架构示意图</w:t>
+      </w:r>
+    </w:p>
+    <w:p>
+      <w:pPr>
+        <w:spacing w:line="276" w:lineRule="auto"/>
+        <w:rPr>
+          <w:rFonts w:ascii="微软雅黑" w:eastAsia="微软雅黑" w:hAnsi="微软雅黑"/>
+          <w:sz w:val="18"/>
+          <w:szCs w:val="18"/>
+        </w:rPr>
+      </w:pPr>
+      <w:r>
+        <w:rPr>
+          <w:rFonts w:ascii="微软雅黑" w:eastAsia="微软雅黑" w:hAnsi="微软雅黑"/>
+          <w:sz w:val="18"/>
+          <w:szCs w:val="18"/>
+          <w:b/>
+          <w:bCs/>
+        </w:rPr>
+        <w:t xml:space="preserve">闭环联动层</w:t>
+      </w:r>
+      <w:r>
+        <w:rPr>
+          <w:rFonts w:ascii="微软雅黑" w:eastAsia="微软雅黑" w:hAnsi="微软雅黑"/>
+          <w:sz w:val="18"/>
+          <w:szCs w:val="18"/>
+        </w:rPr>
+        <w:t xml:space="preserve"> ：将异常样本归档至难例池，按配置周期触发微调与回归任务；将回归结果中的阈值优化建议反写至配置层，形成评估策略的持续自适应更新。</w:t>
+      </w:r>
+    </w:p>
+    <w:p>
+      <w:pPr>
+        <w:jc w:val="center"/>
+      </w:pPr>
+      <w:r>
+        <w:drawing>
+          <wp:inline distT="0" distB="0" distL="0" distR="0">
+            <wp:extent cx="4572000" cy="2493818"/>
+            <wp:effectExtent l="0" t="0" r="0" b="0"/>
+            <wp:docPr id="14" name="Picture 14"/>
+            <wp:cNvGraphicFramePr>
+              <a:graphicFrameLocks xmlns:a="http://schemas.openxmlformats.org/drawingml/2006/main" noChangeAspect="1"/>
+            </wp:cNvGraphicFramePr>
+            <a:graphic xmlns:a="http://schemas.openxmlformats.org/drawingml/2006/main">
+              <a:graphicData uri="http://schemas.openxmlformats.org/drawingml/2006/picture">
+                <pic:pic xmlns:pic="http://schemas.openxmlformats.org/drawingml/2006/picture">
+                  <pic:nvPicPr>
+                    <pic:cNvPr id="14" name="image4.png"/>
+                    <pic:cNvPicPr/>
+                  </pic:nvPicPr>
+                  <pic:blipFill>
+                    <a:blip r:embed="rId19"/>
+                    <a:stretch>
+                      <a:fillRect/>
+                    </a:stretch>
+                  </pic:blipFill>
+                  <pic:spPr>
+                    <a:xfrm>
+                      <a:off x="0" y="0"/>
+                      <a:ext cx="4572000" cy="2493818"/>
+                    </a:xfrm>
+                    <a:prstGeom prst="rect">
+                      <a:avLst/>
+                    </a:prstGeom>
+                  </pic:spPr>
+                </pic:pic>
+              </a:graphicData>
+            </a:graphic>
+          </wp:inline>
+        </w:drawing>
+      </w:r>
+    </w:p>
+    <w:p>
+      <w:pPr>
+        <w:jc w:val="center"/>
+      </w:pPr>
+      <w:r>
+        <w:rPr>
+          <w:sz w:val="18"/>
+          <w:szCs w:val="18"/>
+        </w:rPr>
+        <w:t>图3 数据闭环执行流程图</w:t>
+      </w:r>
+    </w:p>
+    <w:p>
+      <w:pPr>
+        <w:spacing w:line="276" w:lineRule="auto"/>
+        <w:rPr>
+          <w:rFonts w:ascii="微软雅黑" w:eastAsia="微软雅黑" w:hAnsi="微软雅黑"/>
+          <w:sz w:val="18"/>
+          <w:szCs w:val="18"/>
+        </w:rPr>
+      </w:pPr>
+      <w:r>
+        <w:rPr>
+          <w:rFonts w:ascii="微软雅黑" w:eastAsia="微软雅黑" w:hAnsi="微软雅黑"/>
+          <w:sz w:val="18"/>
+          <w:szCs w:val="18"/>
+          <w:b/>
+          <w:bCs/>
+        </w:rPr>
+        <w:t xml:space="preserve">可视化与审计层</w:t>
+      </w:r>
+      <w:r>
+        <w:rPr>
+          <w:rFonts w:ascii="微软雅黑" w:eastAsia="微软雅黑" w:hAnsi="微软雅黑"/>
+          <w:sz w:val="18"/>
+          <w:szCs w:val="18"/>
+        </w:rPr>
+        <w:t xml:space="preserve"> ：提供指标趋势图、异常热区图和误判抽检报告，保留规则版本、阈值版本、执行日志与报告快照，支持完整审计追溯。</w:t>
+      </w:r>
+    </w:p>
+    <w:p>
+      <w:pPr>
+        <w:spacing w:line="276" w:lineRule="auto"/>
+        <w:rPr>
+          <w:rFonts w:ascii="微软雅黑" w:eastAsia="微软雅黑" w:hAnsi="微软雅黑"/>
+          <w:sz w:val="18"/>
+          <w:szCs w:val="18"/>
+        </w:rPr>
+        <w:ind w:firstLineChars="200" w:firstLine="420"/>
+      </w:pPr>
+      <w:r>
+        <w:rPr>
+          <w:rFonts w:ascii="微软雅黑" w:eastAsia="微软雅黑" w:hAnsi="微软雅黑"/>
+          <w:sz w:val="18"/>
+          <w:szCs w:val="18"/>
+        </w:rPr>
+        <w:t xml:space="preserve">典型业务流程：每日批任务执行全量评估并划分A/B/C等级；C级剔除，B级人工抽检，A级直接入训练集；周期触发难例微调与对照回归；若关键指标恶化超过阈值，自动阻断发布或回滚配置。</w:t>
       </w:r>
     </w:p>
     <w:p>
@@ -4053,7 +4254,7 @@
           <w:sz w:val="18"/>
           <w:szCs w:val="18"/>
         </w:rPr>
-        <w:t>图2 质量闸门三级部署架构图</w:t>
+        <w:t>图4 质量闸门三级部署架构图</w:t>
       </w:r>
     </w:p>
     <w:p>
@@ -4237,7 +4438,7 @@
                     </m:r>
                     <m:r>
                       <m:rPr>
-                        <m:sty m:val="p"/>
+                        <m:sty m:val="i"/>
                       </m:rPr>
                       <m:t>×</m:t>
                     </m:r>
@@ -4249,7 +4450,7 @@
                     </m:r>
                     <m:r>
                       <m:rPr>
-                        <m:sty m:val="p"/>
+                        <m:sty m:val="i"/>
                       </m:rPr>
                       <m:t>×</m:t>
                     </m:r>
@@ -4357,7 +4558,7 @@
                     </m:r>
                     <m:r>
                       <m:rPr>
-                        <m:sty m:val="p"/>
+                        <m:sty m:val="i"/>
                       </m:rPr>
                       <m:t>×</m:t>
                     </m:r>
@@ -4380,83 +4581,29 @@
           <w:sz w:val="18"/>
           <w:szCs w:val="18"/>
         </w:rPr>
-        <w:t xml:space="preserve">；</w:t>
-      </w:r>
-    </w:p>
-    <w:p>
-      <w:pPr>
-        <w:spacing w:line="276" w:lineRule="auto"/>
-        <w:rPr>
-          <w:rFonts w:ascii="微软雅黑" w:eastAsia="微软雅黑" w:hAnsi="微软雅黑"/>
-          <w:sz w:val="18"/>
-          <w:szCs w:val="18"/>
-        </w:rPr>
-      </w:pPr>
-      <w:r>
-        <w:rPr>
-          <w:rFonts w:ascii="微软雅黑" w:eastAsia="微软雅黑" w:hAnsi="微软雅黑"/>
-          <w:sz w:val="18"/>
-          <w:szCs w:val="18"/>
-        </w:rPr>
-        <w:t xml:space="preserve">结构信息：网格拓扑 </w:t>
+        <w:t xml:space="preserve">；其中骨骼变换 </w:t>
       </w:r>
       <m:oMath>
         <m:box>
           <m:e>
-            <m:r>
-              <m:rPr>
-                <m:sty m:val="i"/>
-              </m:rPr>
-              <m:t>ℳ</m:t>
-            </m:r>
-            <m:r>
-              <m:rPr>
-                <m:sty m:val="p"/>
-              </m:rPr>
-              <m:t>=</m:t>
-            </m:r>
-            <m:r>
-              <m:rPr>
-                <m:sty m:val="p"/>
-              </m:rPr>
-              <m:t>(</m:t>
-            </m:r>
-            <m:r>
-              <m:rPr>
-                <m:sty m:val="i"/>
-              </m:rPr>
-              <m:t>𝒱</m:t>
-            </m:r>
-            <m:r>
-              <m:rPr>
-                <m:sty m:val="p"/>
-              </m:rPr>
-              <m:t>,</m:t>
-            </m:r>
-            <m:r>
-              <m:rPr>
-                <m:sty m:val="i"/>
-              </m:rPr>
-              <m:t>ℰ</m:t>
-            </m:r>
-            <m:r>
-              <m:rPr>
-                <m:sty m:val="p"/>
-              </m:rPr>
-              <m:t>,</m:t>
-            </m:r>
-            <m:r>
-              <m:rPr>
-                <m:sty m:val="i"/>
-              </m:rPr>
-              <m:t>ℱ</m:t>
-            </m:r>
-            <m:r>
-              <m:rPr>
-                <m:sty m:val="p"/>
-              </m:rPr>
-              <m:t>)</m:t>
-            </m:r>
+            <m:sSub>
+              <m:e>
+                <m:r>
+                  <m:rPr>
+                    <m:sty m:val="i"/>
+                  </m:rPr>
+                  <m:t>𝐁</m:t>
+                </m:r>
+              </m:e>
+              <m:sub>
+                <m:r>
+                  <m:rPr>
+                    <m:sty m:val="i"/>
+                  </m:rPr>
+                  <m:t>t</m:t>
+                </m:r>
+              </m:sub>
+            </m:sSub>
           </m:e>
         </m:box>
       </m:oMath>
@@ -4466,7 +4613,7 @@
           <w:sz w:val="18"/>
           <w:szCs w:val="18"/>
         </w:rPr>
-        <w:t xml:space="preserve">、部位分组 </w:t>
+        <w:t xml:space="preserve"> 是第 </w:t>
       </w:r>
       <m:oMath>
         <m:box>
@@ -4475,7 +4622,7 @@
               <m:rPr>
                 <m:sty m:val="i"/>
               </m:rPr>
-              <m:t>𝒫</m:t>
+              <m:t>t</m:t>
             </m:r>
           </m:e>
         </m:box>
@@ -4486,7 +4633,7 @@
           <w:sz w:val="18"/>
           <w:szCs w:val="18"/>
         </w:rPr>
-        <w:t xml:space="preserve">、骨骼层级 </w:t>
+        <w:t xml:space="preserve"> 帧下每根骨骼从"骨骼局部空间→模型空间"的变换矩阵集合，每个元素对应一根骨骼，完成的正是从绑定姿态空间（T-Pose 时网格所在模型空间）到当前动画姿态空间的映射；权重矩阵 </w:t>
       </w:r>
       <m:oMath>
         <m:box>
@@ -4495,7 +4642,7 @@
               <m:rPr>
                 <m:sty m:val="i"/>
               </m:rPr>
-              <m:t>ℋ</m:t>
+              <m:t>𝐖</m:t>
             </m:r>
           </m:e>
         </m:box>
@@ -4506,7 +4653,261 @@
           <w:sz w:val="18"/>
           <w:szCs w:val="18"/>
         </w:rPr>
-        <w:t xml:space="preserve">；</w:t>
+        <w:t xml:space="preserve"> 的元素 </w:t>
+      </w:r>
+      <m:oMath>
+        <m:box>
+          <m:e>
+            <m:sSub>
+              <m:e>
+                <m:r>
+                  <m:rPr>
+                    <m:sty m:val="i"/>
+                  </m:rPr>
+                  <m:t>W</m:t>
+                </m:r>
+              </m:e>
+              <m:sub>
+                <m:box>
+                  <m:e>
+                    <m:r>
+                      <m:rPr>
+                        <m:sty m:val="i"/>
+                      </m:rPr>
+                      <m:t>n</m:t>
+                    </m:r>
+                    <m:r>
+                      <m:rPr>
+                        <m:sty m:val="p"/>
+                      </m:rPr>
+                      <m:t>,</m:t>
+                    </m:r>
+                    <m:r>
+                      <m:rPr>
+                        <m:sty m:val="i"/>
+                      </m:rPr>
+                      <m:t>b</m:t>
+                    </m:r>
+                  </m:e>
+                </m:box>
+              </m:sub>
+            </m:sSub>
+          </m:e>
+        </m:box>
+      </m:oMath>
+      <w:r>
+        <w:rPr>
+          <w:rFonts w:ascii="微软雅黑" w:eastAsia="微软雅黑" w:hAnsi="微软雅黑"/>
+          <w:sz w:val="18"/>
+          <w:szCs w:val="18"/>
+        </w:rPr>
+        <w:t xml:space="preserve"> 表征顶点 </w:t>
+      </w:r>
+      <m:oMath>
+        <m:box>
+          <m:e>
+            <m:r>
+              <m:rPr>
+                <m:sty m:val="i"/>
+              </m:rPr>
+              <m:t>n</m:t>
+            </m:r>
+          </m:e>
+        </m:box>
+      </m:oMath>
+      <w:r>
+        <w:rPr>
+          <w:rFonts w:ascii="微软雅黑" w:eastAsia="微软雅黑" w:hAnsi="微软雅黑"/>
+          <w:sz w:val="18"/>
+          <w:szCs w:val="18"/>
+        </w:rPr>
+        <w:t xml:space="preserve"> 被骨骼 </w:t>
+      </w:r>
+      <m:oMath>
+        <m:box>
+          <m:e>
+            <m:r>
+              <m:rPr>
+                <m:sty m:val="i"/>
+              </m:rPr>
+              <m:t>b</m:t>
+            </m:r>
+          </m:e>
+        </m:box>
+      </m:oMath>
+      <w:r>
+        <w:rPr>
+          <w:rFonts w:ascii="微软雅黑" w:eastAsia="微软雅黑" w:hAnsi="微软雅黑"/>
+          <w:sz w:val="18"/>
+          <w:szCs w:val="18"/>
+        </w:rPr>
+        <w:t xml:space="preserve"> 影响的程度（比例），每个顶点至少被一根骨骼影响，可同时受多根骨骼影响（对应多个骨骼变换矩阵按权重线性混合，即 LBS 线性混合蒙皮）；</w:t>
+      </w:r>
+    </w:p>
+    <w:p>
+      <w:pPr>
+        <w:spacing w:line="276" w:lineRule="auto"/>
+        <w:rPr>
+          <w:rFonts w:ascii="微软雅黑" w:eastAsia="微软雅黑" w:hAnsi="微软雅黑"/>
+          <w:sz w:val="18"/>
+          <w:szCs w:val="18"/>
+        </w:rPr>
+      </w:pPr>
+      <w:r>
+        <w:rPr>
+          <w:rFonts w:ascii="微软雅黑" w:eastAsia="微软雅黑" w:hAnsi="微软雅黑"/>
+          <w:sz w:val="18"/>
+          <w:szCs w:val="18"/>
+        </w:rPr>
+        <w:t xml:space="preserve">结构信息：网格拓扑 </w:t>
+      </w:r>
+      <m:oMath>
+        <m:box>
+          <m:e>
+            <m:r>
+              <m:rPr>
+                <m:sty m:val="i"/>
+              </m:rPr>
+              <m:t>ℳ</m:t>
+            </m:r>
+            <m:r>
+              <m:rPr>
+                <m:sty m:val="p"/>
+              </m:rPr>
+              <m:t>=</m:t>
+            </m:r>
+            <m:r>
+              <m:rPr>
+                <m:sty m:val="p"/>
+              </m:rPr>
+              <m:t>(</m:t>
+            </m:r>
+            <m:r>
+              <m:rPr>
+                <m:sty m:val="i"/>
+              </m:rPr>
+              <m:t>𝒱</m:t>
+            </m:r>
+            <m:r>
+              <m:rPr>
+                <m:sty m:val="p"/>
+              </m:rPr>
+              <m:t>,</m:t>
+            </m:r>
+            <m:r>
+              <m:rPr>
+                <m:sty m:val="i"/>
+              </m:rPr>
+              <m:t>ℰ</m:t>
+            </m:r>
+            <m:r>
+              <m:rPr>
+                <m:sty m:val="p"/>
+              </m:rPr>
+              <m:t>,</m:t>
+            </m:r>
+            <m:r>
+              <m:rPr>
+                <m:sty m:val="i"/>
+              </m:rPr>
+              <m:t>ℱ</m:t>
+            </m:r>
+            <m:r>
+              <m:rPr>
+                <m:sty m:val="p"/>
+              </m:rPr>
+              <m:t>)</m:t>
+            </m:r>
+          </m:e>
+        </m:box>
+      </m:oMath>
+      <w:r>
+        <w:rPr>
+          <w:rFonts w:ascii="微软雅黑" w:eastAsia="微软雅黑" w:hAnsi="微软雅黑"/>
+          <w:sz w:val="18"/>
+          <w:szCs w:val="18"/>
+        </w:rPr>
+        <w:t xml:space="preserve">、部位分组 </w:t>
+      </w:r>
+      <m:oMath>
+        <m:box>
+          <m:e>
+            <m:r>
+              <m:rPr>
+                <m:sty m:val="i"/>
+              </m:rPr>
+              <m:t>𝒫</m:t>
+            </m:r>
+          </m:e>
+        </m:box>
+      </m:oMath>
+      <w:r>
+        <w:rPr>
+          <w:rFonts w:ascii="微软雅黑" w:eastAsia="微软雅黑" w:hAnsi="微软雅黑"/>
+          <w:sz w:val="18"/>
+          <w:szCs w:val="18"/>
+        </w:rPr>
+        <w:t xml:space="preserve">、骨骼层级 </w:t>
+      </w:r>
+      <m:oMath>
+        <m:box>
+          <m:e>
+            <m:r>
+              <m:rPr>
+                <m:sty m:val="i"/>
+              </m:rPr>
+              <m:t>ℋ</m:t>
+            </m:r>
+          </m:e>
+        </m:box>
+      </m:oMath>
+      <w:r>
+        <w:rPr>
+          <w:rFonts w:ascii="微软雅黑" w:eastAsia="微软雅黑" w:hAnsi="微软雅黑"/>
+          <w:sz w:val="18"/>
+          <w:szCs w:val="18"/>
+        </w:rPr>
+        <w:t xml:space="preserve">；其中部位分组 </w:t>
+      </w:r>
+      <m:oMath>
+        <m:box>
+          <m:e>
+            <m:r>
+              <m:rPr>
+                <m:sty m:val="i"/>
+              </m:rPr>
+              <m:t>𝒫</m:t>
+            </m:r>
+          </m:e>
+        </m:box>
+      </m:oMath>
+      <w:r>
+        <w:rPr>
+          <w:rFonts w:ascii="微软雅黑" w:eastAsia="微软雅黑" w:hAnsi="微软雅黑"/>
+          <w:sz w:val="18"/>
+          <w:szCs w:val="18"/>
+        </w:rPr>
+        <w:t xml:space="preserve"> 将网格顶点按身体部位（头发、躯干、四肢、布料等）划分，同一部位可受至少一根骨骼影响；骨骼层级 </w:t>
+      </w:r>
+      <m:oMath>
+        <m:box>
+          <m:e>
+            <m:r>
+              <m:rPr>
+                <m:sty m:val="i"/>
+              </m:rPr>
+              <m:t>ℋ</m:t>
+            </m:r>
+          </m:e>
+        </m:box>
+      </m:oMath>
+      <w:r>
+        <w:rPr>
+          <w:rFonts w:ascii="微软雅黑" w:eastAsia="微软雅黑" w:hAnsi="微软雅黑"/>
+          <w:sz w:val="18"/>
+          <w:szCs w:val="18"/>
+        </w:rPr>
+        <w:t xml:space="preserve"> 描述骨骼的父子树结构（除根骨骼外每根骨骼有唯一父骨骼，子骨骼的位姿相对父骨骼定义）；</w:t>
       </w:r>
     </w:p>
     <w:p>
@@ -4905,6 +5306,134 @@
           <w:sz w:val="18"/>
           <w:szCs w:val="18"/>
         </w:rPr>
+      </w:pPr>
+      <w:r>
+        <w:rPr>
+          <w:rFonts w:ascii="微软雅黑" w:eastAsia="微软雅黑" w:hAnsi="微软雅黑"/>
+          <w:sz w:val="18"/>
+          <w:szCs w:val="18"/>
+          <w:b/>
+          <w:bCs/>
+        </w:rPr>
+        <w:t xml:space="preserve">关于指标的计算粒度</w:t>
+      </w:r>
+      <w:r>
+        <w:rPr>
+          <w:rFonts w:ascii="微软雅黑" w:eastAsia="微软雅黑" w:hAnsi="微软雅黑"/>
+          <w:sz w:val="18"/>
+          <w:szCs w:val="18"/>
+        </w:rPr>
+        <w:t xml:space="preserve"> ：本发明的指标体系采用"先元素级、后聚合"的统一粒度约定。穿插、粘连、共线/翻折等接触类指标本质上在</w:t>
+      </w:r>
+      <w:r>
+        <w:rPr>
+          <w:rFonts w:ascii="微软雅黑" w:eastAsia="微软雅黑" w:hAnsi="微软雅黑"/>
+          <w:sz w:val="18"/>
+          <w:szCs w:val="18"/>
+          <w:b/>
+          <w:bCs/>
+        </w:rPr>
+        <w:t xml:space="preserve">候选对（面片对/部位对）级</w:t>
+      </w:r>
+      <w:r>
+        <w:rPr>
+          <w:rFonts w:ascii="微软雅黑" w:eastAsia="微软雅黑" w:hAnsi="微软雅黑"/>
+          <w:sz w:val="18"/>
+          <w:szCs w:val="18"/>
+        </w:rPr>
+        <w:t xml:space="preserve">计算，再归并到相关顶点；能量、边界连续性等形变类指标在</w:t>
+      </w:r>
+      <w:r>
+        <w:rPr>
+          <w:rFonts w:ascii="微软雅黑" w:eastAsia="微软雅黑" w:hAnsi="微软雅黑"/>
+          <w:sz w:val="18"/>
+          <w:szCs w:val="18"/>
+          <w:b/>
+          <w:bCs/>
+        </w:rPr>
+        <w:t xml:space="preserve">顶点级</w:t>
+      </w:r>
+      <w:r>
+        <w:rPr>
+          <w:rFonts w:ascii="微软雅黑" w:eastAsia="微软雅黑" w:hAnsi="微软雅黑"/>
+          <w:sz w:val="18"/>
+          <w:szCs w:val="18"/>
+        </w:rPr>
+        <w:t xml:space="preserve">计算。无论哪类指标，最终都在两个层级上被使用：(1) 顶点/面片级 </w:t>
+      </w:r>
+      <m:oMath>
+        <m:box>
+          <m:e>
+            <m:sSub>
+              <m:e>
+                <m:r>
+                  <m:rPr>
+                    <m:sty m:val="i"/>
+                  </m:rPr>
+                  <m:t>z</m:t>
+                </m:r>
+              </m:e>
+              <m:sub>
+                <m:r>
+                  <m:rPr>
+                    <m:sty m:val="i"/>
+                  </m:rPr>
+                  <m:t>i</m:t>
+                </m:r>
+              </m:sub>
+            </m:sSub>
+          </m:e>
+        </m:box>
+      </m:oMath>
+      <w:r>
+        <w:rPr>
+          <w:rFonts w:ascii="微软雅黑" w:eastAsia="微软雅黑" w:hAnsi="微软雅黑"/>
+          <w:sz w:val="18"/>
+          <w:szCs w:val="18"/>
+        </w:rPr>
+        <w:t xml:space="preserve">，用于 §3.2.5 的连通域异常定位；(2) 帧级聚合分数 </w:t>
+      </w:r>
+      <m:oMath>
+        <m:box>
+          <m:e>
+            <m:sSub>
+              <m:e>
+                <m:r>
+                  <m:rPr>
+                    <m:sty m:val="i"/>
+                  </m:rPr>
+                  <m:t>Q</m:t>
+                </m:r>
+              </m:e>
+              <m:sub>
+                <m:r>
+                  <m:rPr>
+                    <m:sty m:val="i"/>
+                  </m:rPr>
+                  <m:t>t</m:t>
+                </m:r>
+              </m:sub>
+            </m:sSub>
+          </m:e>
+        </m:box>
+      </m:oMath>
+      <w:r>
+        <w:rPr>
+          <w:rFonts w:ascii="微软雅黑" w:eastAsia="微软雅黑" w:hAnsi="微软雅黑"/>
+          <w:sz w:val="18"/>
+          <w:szCs w:val="18"/>
+        </w:rPr>
+        <w:t xml:space="preserve">（§3.2.4，对同一帧内所有部位/候选对的指标做加权求和并叠加门控），用于 §3.2.4 的帧级分级与时序平滑。因此"指标值"既存在顶点维度的版本，也存在帧维度的版本，二者通过部位级分位数（§3.2.3）与帧级求和（§3.2.4）逐层聚合而得。</w:t>
+      </w:r>
+    </w:p>
+    <w:p>
+      <w:pPr>
+        <w:spacing w:line="276" w:lineRule="auto"/>
+        <w:rPr>
+          <w:rFonts w:ascii="微软雅黑" w:eastAsia="微软雅黑" w:hAnsi="微软雅黑"/>
+          <w:sz w:val="18"/>
+          <w:szCs w:val="18"/>
+        </w:rPr>
         <w:ind w:firstLineChars="200" w:firstLine="420"/>
       </w:pPr>
       <w:r>
@@ -4980,7 +5509,43 @@
           <w:sz w:val="18"/>
           <w:szCs w:val="18"/>
         </w:rPr>
-        <w:t xml:space="preserve">基于几何体相交深度 </w:t>
+        <w:t xml:space="preserve">穿插指标 </w:t>
+      </w:r>
+      <m:oMath>
+        <m:box>
+          <m:e>
+            <m:sSub>
+              <m:e>
+                <m:r>
+                  <m:rPr>
+                    <m:sty m:val="i"/>
+                  </m:rPr>
+                  <m:t>m</m:t>
+                </m:r>
+              </m:e>
+              <m:sub>
+                <m:box>
+                  <m:e>
+                    <m:r>
+                      <m:rPr>
+                        <m:nor/>
+                      </m:rPr>
+                      <m:t>pen</m:t>
+                    </m:r>
+                  </m:e>
+                </m:box>
+              </m:sub>
+            </m:sSub>
+          </m:e>
+        </m:box>
+      </m:oMath>
+      <w:r>
+        <w:rPr>
+          <w:rFonts w:ascii="微软雅黑" w:eastAsia="微软雅黑" w:hAnsi="微软雅黑"/>
+          <w:sz w:val="18"/>
+          <w:szCs w:val="18"/>
+        </w:rPr>
+        <w:t xml:space="preserve"> 用于衡量蒙皮结果（即由骨骼变换与权重驱动得到的当前帧网格）中不同部位之间自相交（穿模）的严重程度。基于几何体相交深度 </w:t>
       </w:r>
       <m:oMath>
         <m:box>
@@ -5254,7 +5819,7 @@
                   <m:e>
                     <m:r>
                       <m:rPr>
-                        <m:sty m:val="p"/>
+                        <m:sty m:val="i"/>
                       </m:rPr>
                       <m:t>·</m:t>
                     </m:r>
@@ -5279,7 +5844,43 @@
           <w:sz w:val="18"/>
           <w:szCs w:val="18"/>
         </w:rPr>
-        <w:t xml:space="preserve"> 表示按各自参数范围归一化后的量。具体地，相交深度 </w:t>
+        <w:t xml:space="preserve"> 表示按各自参数范围归一化后的量。各量定义如下：</w:t>
+      </w:r>
+      <w:r>
+        <w:rPr>
+          <w:rFonts w:ascii="微软雅黑" w:eastAsia="微软雅黑" w:hAnsi="微软雅黑"/>
+          <w:sz w:val="18"/>
+          <w:szCs w:val="18"/>
+          <w:b/>
+          <w:bCs/>
+        </w:rPr>
+        <w:t xml:space="preserve">候选面片对</w:t>
+      </w:r>
+      <w:r>
+        <w:rPr>
+          <w:rFonts w:ascii="微软雅黑" w:eastAsia="微软雅黑" w:hAnsi="微软雅黑"/>
+          <w:sz w:val="18"/>
+          <w:szCs w:val="18"/>
+        </w:rPr>
+        <w:t xml:space="preserve">指当前帧蒙皮结果中来自两个不同部位、且通过宽相（AABB）检测判定"可能相交"的一对三角面片（仅是候选，不一定真的穿插）；</w:t>
+      </w:r>
+      <w:r>
+        <w:rPr>
+          <w:rFonts w:ascii="微软雅黑" w:eastAsia="微软雅黑" w:hAnsi="微软雅黑"/>
+          <w:sz w:val="18"/>
+          <w:szCs w:val="18"/>
+          <w:b/>
+          <w:bCs/>
+        </w:rPr>
+        <w:t xml:space="preserve">相交深度</w:t>
+      </w:r>
+      <w:r>
+        <w:rPr>
+          <w:rFonts w:ascii="微软雅黑" w:eastAsia="微软雅黑" w:hAnsi="微软雅黑"/>
+          <w:sz w:val="18"/>
+          <w:szCs w:val="18"/>
+        </w:rPr>
+        <w:t xml:space="preserve"> </w:t>
       </w:r>
       <m:oMath>
         <m:box>
@@ -5299,7 +5900,25 @@
           <w:sz w:val="18"/>
           <w:szCs w:val="18"/>
         </w:rPr>
-        <w:t xml:space="preserve"> 定义为沿接触法线方向两物体最大穿透距离，通过对候选面片对执行最近点投影并取有符号距离的负值部分获得；相交面积 </w:t>
+        <w:t xml:space="preserve"> 定义为沿接触法线方向"两物体"（即发生穿插的两个部位对应的面片）最大穿透距离——若面片1上的点落在面片2内侧（穿透了面片2），则取其沿面片2法线的有符号距离负值作为局部穿透深度，所有此类值的最大值即为最大穿透距离，工程上通过对候选面片对执行最近点投影并取有符号距离的负值部分获得；</w:t>
+      </w:r>
+      <w:r>
+        <w:rPr>
+          <w:rFonts w:ascii="微软雅黑" w:eastAsia="微软雅黑" w:hAnsi="微软雅黑"/>
+          <w:sz w:val="18"/>
+          <w:szCs w:val="18"/>
+          <w:b/>
+          <w:bCs/>
+        </w:rPr>
+        <w:t xml:space="preserve">相交面积</w:t>
+      </w:r>
+      <w:r>
+        <w:rPr>
+          <w:rFonts w:ascii="微软雅黑" w:eastAsia="微软雅黑" w:hAnsi="微软雅黑"/>
+          <w:sz w:val="18"/>
+          <w:szCs w:val="18"/>
+        </w:rPr>
+        <w:t xml:space="preserve"> </w:t>
       </w:r>
       <m:oMath>
         <m:box>
@@ -5319,7 +5938,77 @@
           <w:sz w:val="18"/>
           <w:szCs w:val="18"/>
         </w:rPr>
-        <w:t xml:space="preserve"> 由所有穿透面片的三角形面积之和近似；持续帧贡献 </w:t>
+        <w:t xml:space="preserve"> 为当前帧全部穿透其他面片的三角面片面积之和近似；</w:t>
+      </w:r>
+      <w:r>
+        <w:rPr>
+          <w:rFonts w:ascii="微软雅黑" w:eastAsia="微软雅黑" w:hAnsi="微软雅黑"/>
+          <w:sz w:val="18"/>
+          <w:szCs w:val="18"/>
+          <w:b/>
+          <w:bCs/>
+        </w:rPr>
+        <w:t xml:space="preserve">持续帧数</w:t>
+      </w:r>
+      <w:r>
+        <w:rPr>
+          <w:rFonts w:ascii="微软雅黑" w:eastAsia="微软雅黑" w:hAnsi="微软雅黑"/>
+          <w:sz w:val="18"/>
+          <w:szCs w:val="18"/>
+        </w:rPr>
+        <w:t xml:space="preserve"> </w:t>
+      </w:r>
+      <m:oMath>
+        <m:box>
+          <m:e>
+            <m:r>
+              <m:rPr>
+                <m:sty m:val="i"/>
+              </m:rPr>
+              <m:t>c</m:t>
+            </m:r>
+          </m:e>
+        </m:box>
+      </m:oMath>
+      <w:r>
+        <w:rPr>
+          <w:rFonts w:ascii="微软雅黑" w:eastAsia="微软雅黑" w:hAnsi="微软雅黑"/>
+          <w:sz w:val="18"/>
+          <w:szCs w:val="18"/>
+        </w:rPr>
+        <w:t xml:space="preserve"> 指当前候选片对在当前帧之前已经连续穿插的帧数（若当前帧未发生穿插则 </w:t>
+      </w:r>
+      <m:oMath>
+        <m:box>
+          <m:e>
+            <m:r>
+              <m:rPr>
+                <m:sty m:val="i"/>
+              </m:rPr>
+              <m:t>c</m:t>
+            </m:r>
+            <m:r>
+              <m:rPr>
+                <m:sty m:val="p"/>
+              </m:rPr>
+              <m:t>=</m:t>
+            </m:r>
+            <m:r>
+              <m:rPr>
+                <m:sty m:val="p"/>
+              </m:rPr>
+              <m:t>0</m:t>
+            </m:r>
+          </m:e>
+        </m:box>
+      </m:oMath>
+      <w:r>
+        <w:rPr>
+          <w:rFonts w:ascii="微软雅黑" w:eastAsia="微软雅黑" w:hAnsi="微软雅黑"/>
+          <w:sz w:val="18"/>
+          <w:szCs w:val="18"/>
+        </w:rPr>
+        <w:t xml:space="preserve">），其归一化贡献 </w:t>
       </w:r>
       <m:oMath>
         <m:box>
@@ -5421,7 +6110,7 @@
           <w:sz w:val="18"/>
           <w:szCs w:val="18"/>
         </w:rPr>
-        <w:t xml:space="preserve">，其中 </w:t>
+        <w:t xml:space="preserve">，</w:t>
       </w:r>
       <m:oMath>
         <m:box>
@@ -5453,7 +6142,7 @@
           <w:sz w:val="18"/>
           <w:szCs w:val="18"/>
         </w:rPr>
-        <w:t xml:space="preserve"> 为持续帧饱和阈值（典型值5-15帧）。权重典型取值为 </w:t>
+        <w:t xml:space="preserve"> 为预设的持续帧饱和阈值（典型值5-15帧）。权重典型取值为 </w:t>
       </w:r>
       <m:oMath>
         <m:box>
@@ -5636,7 +6325,7 @@
           <w:sz w:val="18"/>
           <w:szCs w:val="18"/>
         </w:rPr>
-        <w:t xml:space="preserve">基于持续近距离、相对速度一致性（低相对速度模长）和法线一致性（法线夹角保持稳定）联合建模：</w:t>
+        <w:t xml:space="preserve">粘连指标与穿插指标共用同一套候选对：均以当前帧中通过宽相（AABB）检测判定为"可能相交/接近"的两个部位（面片对）为计算对象，而非对全部两两部位穷举；两个指标的候选对生成方式一致，因此其"可能相交的部位集合"也相同，区别仅在于穿插指标关注"已穿透"的对、粘连指标关注"持续贴近但未必穿透"的对。基于持续近距离、相对速度一致性（低相对速度模长）和法线一致性（法线夹角保持稳定）联合建模：</w:t>
       </w:r>
     </w:p>
     <w:p>
@@ -6131,7 +6820,7 @@
           <w:sz w:val="18"/>
           <w:szCs w:val="18"/>
         </w:rPr>
-        <w:t xml:space="preserve"> 为法线一致性项，</w:t>
+        <w:t xml:space="preserve"> 为法线一致性项（衡量相邻面片或对应点的法向量方向是否尽可能一致：方向越一致、越贴合参考方向，越视为"粘住"，从而提高粘连分数），</w:t>
       </w:r>
       <m:oMath>
         <m:box>
@@ -7288,27 +7977,7 @@
           <w:sz w:val="18"/>
           <w:szCs w:val="18"/>
         </w:rPr>
-        <w:t xml:space="preserve">。本发明将该指标作为可插拔模块引用，完整实现参见并发专利03。</w:t>
-      </w:r>
-    </w:p>
-    <w:p>
-      <w:pPr>
-        <w:spacing w:line="276" w:lineRule="auto"/>
-        <w:rPr>
-          <w:rFonts w:ascii="微软雅黑" w:eastAsia="微软雅黑" w:hAnsi="微软雅黑"/>
-          <w:sz w:val="18"/>
-          <w:szCs w:val="18"/>
-        </w:rPr>
-      </w:pPr>
-      <w:r>
-        <w:rPr>
-          <w:rFonts w:ascii="微软雅黑" w:eastAsia="微软雅黑" w:hAnsi="微软雅黑"/>
-          <w:sz w:val="18"/>
-          <w:szCs w:val="18"/>
-          <w:b/>
-          <w:bCs/>
-        </w:rPr>
-        <w:t xml:space="preserve">说明：本指标为多专利协同体系中的共享检测模块，专利02在闭环评估框架中以插件方式集成该指标，专利03提供其完整数学推导与工程实现。</w:t>
+        <w:t xml:space="preserve">。本指标在本发明的闭环评估框架中以可插拔模块的形式集成，完整数学推导与工程实现可由独立的 SAT 共线/形变检测方案提供。</w:t>
       </w:r>
     </w:p>
     <w:p>
@@ -8547,60 +9216,6 @@
     </w:p>
     <w:p>
       <w:pPr>
-        <w:jc w:val="center"/>
-      </w:pPr>
-      <w:r>
-        <w:drawing>
-          <wp:inline distT="0" distB="0" distL="0" distR="0">
-            <wp:extent cx="4572000" cy="2493818"/>
-            <wp:effectExtent l="0" t="0" r="0" b="0"/>
-            <wp:docPr id="13" name="Picture 13"/>
-            <wp:cNvGraphicFramePr>
-              <a:graphicFrameLocks xmlns:a="http://schemas.openxmlformats.org/drawingml/2006/main" noChangeAspect="1"/>
-            </wp:cNvGraphicFramePr>
-            <a:graphic xmlns:a="http://schemas.openxmlformats.org/drawingml/2006/main">
-              <a:graphicData uri="http://schemas.openxmlformats.org/drawingml/2006/picture">
-                <pic:pic xmlns:pic="http://schemas.openxmlformats.org/drawingml/2006/picture">
-                  <pic:nvPicPr>
-                    <pic:cNvPr id="13" name="image3.png"/>
-                    <pic:cNvPicPr/>
-                  </pic:nvPicPr>
-                  <pic:blipFill>
-                    <a:blip r:embed="rId18"/>
-                    <a:stretch>
-                      <a:fillRect/>
-                    </a:stretch>
-                  </pic:blipFill>
-                  <pic:spPr>
-                    <a:xfrm>
-                      <a:off x="0" y="0"/>
-                      <a:ext cx="4572000" cy="2493818"/>
-                    </a:xfrm>
-                    <a:prstGeom prst="rect">
-                      <a:avLst/>
-                    </a:prstGeom>
-                  </pic:spPr>
-                </pic:pic>
-              </a:graphicData>
-            </a:graphic>
-          </wp:inline>
-        </w:drawing>
-      </w:r>
-    </w:p>
-    <w:p>
-      <w:pPr>
-        <w:jc w:val="center"/>
-      </w:pPr>
-      <w:r>
-        <w:rPr>
-          <w:sz w:val="18"/>
-          <w:szCs w:val="18"/>
-        </w:rPr>
-        <w:t>图3 可插拔指标计算架构示意图</w:t>
-      </w:r>
-    </w:p>
-    <w:p>
-      <w:pPr>
         <w:spacing w:line="276" w:lineRule="auto"/>
         <w:rPr>
           <w:rFonts w:ascii="微软雅黑" w:eastAsia="微软雅黑" w:hAnsi="微软雅黑"/>
@@ -9179,7 +9794,7 @@
             </m:r>
             <m:r>
               <m:rPr>
-                <m:sty m:val="p"/>
+                <m:sty m:val="i"/>
               </m:rPr>
               <m:t>·</m:t>
             </m:r>
@@ -9250,6 +9865,66 @@
           <w:sz w:val="18"/>
           <w:szCs w:val="18"/>
         </w:rPr>
+        <w:t xml:space="preserve">。这里的统计对象是：一个角色对应多帧，针对某一指标，每一帧的每个候选部位（即前面实际算出该指标的部位，而非全部部位）都得到一个该部位的指标值（该值由该部位对应顶点的指标值聚合而来，如取域内最大或均值）；将同一候选部位在多帧上的这些值汇成样本集合，取其第 95% 分位（从大到小排约处于前 5%）作为该部位该指标的高阈值 </w:t>
+      </w:r>
+      <m:oMath>
+        <m:box>
+          <m:e>
+            <m:sSubSup>
+              <m:e>
+                <m:r>
+                  <m:rPr>
+                    <m:sty m:val="i"/>
+                  </m:rPr>
+                  <m:t>τ</m:t>
+                </m:r>
+              </m:e>
+              <m:sub>
+                <m:box>
+                  <m:e>
+                    <m:r>
+                      <m:rPr>
+                        <m:sty m:val="i"/>
+                      </m:rPr>
+                      <m:t>i</m:t>
+                    </m:r>
+                    <m:r>
+                      <m:rPr>
+                        <m:sty m:val="p"/>
+                      </m:rPr>
+                      <m:t>,</m:t>
+                    </m:r>
+                    <m:r>
+                      <m:rPr>
+                        <m:sty m:val="i"/>
+                      </m:rPr>
+                      <m:t>p</m:t>
+                    </m:r>
+                  </m:e>
+                </m:box>
+              </m:sub>
+              <m:sup>
+                <m:box>
+                  <m:e>
+                    <m:r>
+                      <m:rPr>
+                        <m:nor/>
+                      </m:rPr>
+                      <m:t>high</m:t>
+                    </m:r>
+                  </m:e>
+                </m:box>
+              </m:sup>
+            </m:sSubSup>
+          </m:e>
+        </m:box>
+      </m:oMath>
+      <w:r>
+        <w:rPr>
+          <w:rFonts w:ascii="微软雅黑" w:eastAsia="微软雅黑" w:hAnsi="微软雅黑"/>
+          <w:sz w:val="18"/>
+          <w:szCs w:val="18"/>
+        </w:rPr>
         <w:t xml:space="preserve">。</w:t>
       </w:r>
     </w:p>
@@ -9287,7 +9962,7 @@
           <w:sz w:val="18"/>
           <w:szCs w:val="18"/>
         </w:rPr>
-        <w:t xml:space="preserve">（由工程师根据经验设定全局值，适用于已标定项目）、</w:t>
+        <w:t xml:space="preserve">（由工程师根据经验设定全局值，适用于已标定、分布稳定的项目，如成熟量产角色）、</w:t>
       </w:r>
       <w:r>
         <w:rPr>
@@ -9429,7 +10104,7 @@
           <w:sz w:val="18"/>
           <w:szCs w:val="18"/>
         </w:rPr>
-        <w:t xml:space="preserve">，适用于冷启动场景）、</w:t>
+        <w:t xml:space="preserve">，适用于缺乏先验的冷启动场景，如新角色类型/新服装首次接入、动作范围未知的探索阶段）、</w:t>
       </w:r>
       <w:r>
         <w:rPr>
@@ -9467,7 +10142,111 @@
           <w:sz w:val="18"/>
           <w:szCs w:val="18"/>
         </w:rPr>
-        <w:t xml:space="preserve">，头发部位阈值放宽、躯干收紧，分层粒度可配置为1-3级）。三种策略可按项目需求混合使用。</w:t>
+        <w:t xml:space="preserve">，对不同部位分别套用分位数自适应阈值，适用于不同部位形变差异大的场景，如同时含头发/布料/躯干的复杂角色）。其中"头发部位阈值放宽"即对头发部位取较大的分位数 </w:t>
+      </w:r>
+      <m:oMath>
+        <m:box>
+          <m:e>
+            <m:r>
+              <m:rPr>
+                <m:sty m:val="i"/>
+              </m:rPr>
+              <m:t>q</m:t>
+            </m:r>
+          </m:e>
+        </m:box>
+      </m:oMath>
+      <w:r>
+        <w:rPr>
+          <w:rFonts w:ascii="微软雅黑" w:eastAsia="微软雅黑" w:hAnsi="微软雅黑"/>
+          <w:sz w:val="18"/>
+          <w:szCs w:val="18"/>
+        </w:rPr>
+        <w:t xml:space="preserve">（如 </w:t>
+      </w:r>
+      <m:oMath>
+        <m:box>
+          <m:e>
+            <m:r>
+              <m:rPr>
+                <m:sty m:val="i"/>
+              </m:rPr>
+              <m:t>q</m:t>
+            </m:r>
+            <m:r>
+              <m:rPr>
+                <m:sty m:val="p"/>
+              </m:rPr>
+              <m:t>=</m:t>
+            </m:r>
+            <m:r>
+              <m:rPr>
+                <m:sty m:val="p"/>
+              </m:rPr>
+              <m:t>0.98</m:t>
+            </m:r>
+          </m:e>
+        </m:box>
+      </m:oMath>
+      <w:r>
+        <w:rPr>
+          <w:rFonts w:ascii="微软雅黑" w:eastAsia="微软雅黑" w:hAnsi="微软雅黑"/>
+          <w:sz w:val="18"/>
+          <w:szCs w:val="18"/>
+        </w:rPr>
+        <w:t xml:space="preserve">，容忍头发本身较大的形变与自接触）、"躯干收紧"即对躯干取较小的分位数 </w:t>
+      </w:r>
+      <m:oMath>
+        <m:box>
+          <m:e>
+            <m:r>
+              <m:rPr>
+                <m:sty m:val="i"/>
+              </m:rPr>
+              <m:t>q</m:t>
+            </m:r>
+          </m:e>
+        </m:box>
+      </m:oMath>
+      <w:r>
+        <w:rPr>
+          <w:rFonts w:ascii="微软雅黑" w:eastAsia="微软雅黑" w:hAnsi="微软雅黑"/>
+          <w:sz w:val="18"/>
+          <w:szCs w:val="18"/>
+        </w:rPr>
+        <w:t xml:space="preserve">（如 </w:t>
+      </w:r>
+      <m:oMath>
+        <m:box>
+          <m:e>
+            <m:r>
+              <m:rPr>
+                <m:sty m:val="i"/>
+              </m:rPr>
+              <m:t>q</m:t>
+            </m:r>
+            <m:r>
+              <m:rPr>
+                <m:sty m:val="p"/>
+              </m:rPr>
+              <m:t>=</m:t>
+            </m:r>
+            <m:r>
+              <m:rPr>
+                <m:sty m:val="p"/>
+              </m:rPr>
+              <m:t>0.90</m:t>
+            </m:r>
+          </m:e>
+        </m:box>
+      </m:oMath>
+      <w:r>
+        <w:rPr>
+          <w:rFonts w:ascii="微软雅黑" w:eastAsia="微软雅黑" w:hAnsi="微软雅黑"/>
+          <w:sz w:val="18"/>
+          <w:szCs w:val="18"/>
+        </w:rPr>
+        <w:t xml:space="preserve">，对躯干穿插更敏感），分层粒度可配置为1-3级。三种策略可按项目需求混合使用：分布稳定选固定阈值、冷启动选分位数阈值、部位差异大选分部位自适应。</w:t>
       </w:r>
     </w:p>
     <w:p>
@@ -9504,7 +10283,57 @@
           <w:sz w:val="18"/>
           <w:szCs w:val="18"/>
         </w:rPr>
-        <w:t xml:space="preserve">聚合总分采用加权和与门控惩罚相结合的形式：</w:t>
+        <w:t xml:space="preserve">聚合总分采用加权和与门控惩罚相结合的形式（该总分为</w:t>
+      </w:r>
+      <w:r>
+        <w:rPr>
+          <w:rFonts w:ascii="微软雅黑" w:eastAsia="微软雅黑" w:hAnsi="微软雅黑"/>
+          <w:sz w:val="18"/>
+          <w:szCs w:val="18"/>
+          <w:b/>
+          <w:bCs/>
+        </w:rPr>
+        <w:t xml:space="preserve">帧级</w:t>
+      </w:r>
+      <w:r>
+        <w:rPr>
+          <w:rFonts w:ascii="微软雅黑" w:eastAsia="微软雅黑" w:hAnsi="微软雅黑"/>
+          <w:sz w:val="18"/>
+          <w:szCs w:val="18"/>
+        </w:rPr>
+        <w:t xml:space="preserve">结果，即对同一帧内各部位/各指标的归一化分数 </w:t>
+      </w:r>
+      <m:oMath>
+        <m:box>
+          <m:e>
+            <m:sSub>
+              <m:e>
+                <m:r>
+                  <m:rPr>
+                    <m:sty m:val="i"/>
+                  </m:rPr>
+                  <m:t>z</m:t>
+                </m:r>
+              </m:e>
+              <m:sub>
+                <m:r>
+                  <m:rPr>
+                    <m:sty m:val="i"/>
+                  </m:rPr>
+                  <m:t>i</m:t>
+                </m:r>
+              </m:sub>
+            </m:sSub>
+          </m:e>
+        </m:box>
+      </m:oMath>
+      <w:r>
+        <w:rPr>
+          <w:rFonts w:ascii="微软雅黑" w:eastAsia="微软雅黑" w:hAnsi="微软雅黑"/>
+          <w:sz w:val="18"/>
+          <w:szCs w:val="18"/>
+        </w:rPr>
+        <w:t xml:space="preserve"> 一起加权求和后再叠加门控惩罚）：</w:t>
       </w:r>
     </w:p>
     <w:p>
@@ -9659,7 +10488,47 @@
           <w:sz w:val="18"/>
           <w:szCs w:val="18"/>
         </w:rPr>
-        <w:t xml:space="preserve">其中 </w:t>
+        <w:t xml:space="preserve">其中下标 </w:t>
+      </w:r>
+      <m:oMath>
+        <m:box>
+          <m:e>
+            <m:r>
+              <m:rPr>
+                <m:sty m:val="i"/>
+              </m:rPr>
+              <m:t>i</m:t>
+            </m:r>
+          </m:e>
+        </m:box>
+      </m:oMath>
+      <w:r>
+        <w:rPr>
+          <w:rFonts w:ascii="微软雅黑" w:eastAsia="微软雅黑" w:hAnsi="微软雅黑"/>
+          <w:sz w:val="18"/>
+          <w:szCs w:val="18"/>
+        </w:rPr>
+        <w:t xml:space="preserve"> 遍历指标集 </w:t>
+      </w:r>
+      <m:oMath>
+        <m:box>
+          <m:e>
+            <m:r>
+              <m:rPr>
+                <m:sty m:val="i"/>
+              </m:rPr>
+              <m:t>ℐ</m:t>
+            </m:r>
+          </m:e>
+        </m:box>
+      </m:oMath>
+      <w:r>
+        <w:rPr>
+          <w:rFonts w:ascii="微软雅黑" w:eastAsia="微软雅黑" w:hAnsi="微软雅黑"/>
+          <w:sz w:val="18"/>
+          <w:szCs w:val="18"/>
+        </w:rPr>
+        <w:t xml:space="preserve">；</w:t>
       </w:r>
       <m:oMath>
         <m:box>
@@ -9757,7 +10626,241 @@
           <w:sz w:val="18"/>
           <w:szCs w:val="18"/>
         </w:rPr>
-        <w:t xml:space="preserve"> 时施加额外惩罚，防止总分掩盖局部严重异常。为抑制瞬时帧噪声，对时序分数执行指数平滑：</w:t>
+        <w:t xml:space="preserve"> 时施加额外惩罚，防止总分掩盖局部严重异常（此处改用 </w:t>
+      </w:r>
+      <m:oMath>
+        <m:box>
+          <m:e>
+            <m:r>
+              <m:rPr>
+                <m:sty m:val="i"/>
+              </m:rPr>
+              <m:t>j</m:t>
+            </m:r>
+          </m:e>
+        </m:box>
+      </m:oMath>
+      <w:r>
+        <w:rPr>
+          <w:rFonts w:ascii="微软雅黑" w:eastAsia="微软雅黑" w:hAnsi="微软雅黑"/>
+          <w:sz w:val="18"/>
+          <w:szCs w:val="18"/>
+        </w:rPr>
+        <w:t xml:space="preserve"> 仅为强调"被检查的是某一个具体的关键指标"，</w:t>
+      </w:r>
+      <m:oMath>
+        <m:box>
+          <m:e>
+            <m:r>
+              <m:rPr>
+                <m:sty m:val="i"/>
+              </m:rPr>
+              <m:t>j</m:t>
+            </m:r>
+          </m:e>
+        </m:box>
+      </m:oMath>
+      <w:r>
+        <w:rPr>
+          <w:rFonts w:ascii="微软雅黑" w:eastAsia="微软雅黑" w:hAnsi="微软雅黑"/>
+          <w:sz w:val="18"/>
+          <w:szCs w:val="18"/>
+        </w:rPr>
+        <w:t xml:space="preserve"> 是 </w:t>
+      </w:r>
+      <m:oMath>
+        <m:box>
+          <m:e>
+            <m:r>
+              <m:rPr>
+                <m:sty m:val="i"/>
+              </m:rPr>
+              <m:t>ℐ</m:t>
+            </m:r>
+          </m:e>
+        </m:box>
+      </m:oMath>
+      <w:r>
+        <w:rPr>
+          <w:rFonts w:ascii="微软雅黑" w:eastAsia="微软雅黑" w:hAnsi="微软雅黑"/>
+          <w:sz w:val="18"/>
+          <w:szCs w:val="18"/>
+        </w:rPr>
+        <w:t xml:space="preserve"> 中的一个具体下标，与求和下标 </w:t>
+      </w:r>
+      <m:oMath>
+        <m:box>
+          <m:e>
+            <m:r>
+              <m:rPr>
+                <m:sty m:val="i"/>
+              </m:rPr>
+              <m:t>i</m:t>
+            </m:r>
+          </m:e>
+        </m:box>
+      </m:oMath>
+      <w:r>
+        <w:rPr>
+          <w:rFonts w:ascii="微软雅黑" w:eastAsia="微软雅黑" w:hAnsi="微软雅黑"/>
+          <w:sz w:val="18"/>
+          <w:szCs w:val="18"/>
+        </w:rPr>
+        <w:t xml:space="preserve"> 同属一个指标集，并无新含义）。</w:t>
+      </w:r>
+      <m:oMath>
+        <m:box>
+          <m:e>
+            <m:sSub>
+              <m:e>
+                <m:r>
+                  <m:rPr>
+                    <m:sty m:val="i"/>
+                  </m:rPr>
+                  <m:t>γ</m:t>
+                </m:r>
+              </m:e>
+              <m:sub>
+                <m:box>
+                  <m:e>
+                    <m:r>
+                      <m:rPr>
+                        <m:nor/>
+                      </m:rPr>
+                      <m:t>crit</m:t>
+                    </m:r>
+                  </m:e>
+                </m:box>
+              </m:sub>
+            </m:sSub>
+          </m:e>
+        </m:box>
+      </m:oMath>
+      <w:r>
+        <w:rPr>
+          <w:rFonts w:ascii="微软雅黑" w:eastAsia="微软雅黑" w:hAnsi="微软雅黑"/>
+          <w:sz w:val="18"/>
+          <w:szCs w:val="18"/>
+        </w:rPr>
+        <w:t xml:space="preserve"> 为预设的关键指标触发阈值（在归一化分数 </w:t>
+      </w:r>
+      <m:oMath>
+        <m:box>
+          <m:e>
+            <m:r>
+              <m:rPr>
+                <m:sty m:val="p"/>
+              </m:rPr>
+              <m:t>[</m:t>
+            </m:r>
+            <m:r>
+              <m:rPr>
+                <m:sty m:val="p"/>
+              </m:rPr>
+              <m:t>0</m:t>
+            </m:r>
+            <m:r>
+              <m:rPr>
+                <m:sty m:val="p"/>
+              </m:rPr>
+              <m:t>,</m:t>
+            </m:r>
+            <m:r>
+              <m:rPr>
+                <m:sty m:val="p"/>
+              </m:rPr>
+              <m:t>1</m:t>
+            </m:r>
+            <m:r>
+              <m:rPr>
+                <m:sty m:val="p"/>
+              </m:rPr>
+              <m:t>]</m:t>
+            </m:r>
+          </m:e>
+        </m:box>
+      </m:oMath>
+      <w:r>
+        <w:rPr>
+          <w:rFonts w:ascii="微软雅黑" w:eastAsia="微软雅黑" w:hAnsi="微软雅黑"/>
+          <w:sz w:val="18"/>
+          <w:szCs w:val="18"/>
+        </w:rPr>
+        <w:t xml:space="preserve"> 上典型取 0.7~0.85），不同关键指标可配置各自的 </w:t>
+      </w:r>
+      <m:oMath>
+        <m:box>
+          <m:e>
+            <m:sSub>
+              <m:e>
+                <m:r>
+                  <m:rPr>
+                    <m:sty m:val="i"/>
+                  </m:rPr>
+                  <m:t>γ</m:t>
+                </m:r>
+              </m:e>
+              <m:sub>
+                <m:box>
+                  <m:e>
+                    <m:r>
+                      <m:rPr>
+                        <m:nor/>
+                      </m:rPr>
+                      <m:t>crit</m:t>
+                    </m:r>
+                  </m:e>
+                </m:box>
+              </m:sub>
+            </m:sSub>
+          </m:e>
+        </m:box>
+      </m:oMath>
+      <w:r>
+        <w:rPr>
+          <w:rFonts w:ascii="微软雅黑" w:eastAsia="微软雅黑" w:hAnsi="微软雅黑"/>
+          <w:sz w:val="18"/>
+          <w:szCs w:val="18"/>
+        </w:rPr>
+        <w:t xml:space="preserve">（默认相同，也允许按指标单独设定）；门控惩罚 </w:t>
+      </w:r>
+      <m:oMath>
+        <m:box>
+          <m:e>
+            <m:r>
+              <m:rPr>
+                <m:sty m:val="i"/>
+              </m:rPr>
+              <m:t>g</m:t>
+            </m:r>
+            <m:r>
+              <m:rPr>
+                <m:sty m:val="p"/>
+              </m:rPr>
+              <m:t>(</m:t>
+            </m:r>
+            <m:r>
+              <m:rPr>
+                <m:sty m:val="i"/>
+              </m:rPr>
+              <m:t>𝐳</m:t>
+            </m:r>
+            <m:r>
+              <m:rPr>
+                <m:sty m:val="p"/>
+              </m:rPr>
+              <m:t>)</m:t>
+            </m:r>
+          </m:e>
+        </m:box>
+      </m:oMath>
+      <w:r>
+        <w:rPr>
+          <w:rFonts w:ascii="微软雅黑" w:eastAsia="微软雅黑" w:hAnsi="微软雅黑"/>
+          <w:sz w:val="18"/>
+          <w:szCs w:val="18"/>
+        </w:rPr>
+        <w:t xml:space="preserve"> 的强度同样为预设值（典型为固定加罚常数 0.2~0.5 或按超出量线性放大）。为抑制瞬时帧噪声，对时序分数执行指数平滑：</w:t>
       </w:r>
     </w:p>
     <w:p>
@@ -9950,25 +11053,39 @@
           <w:sz w:val="18"/>
           <w:szCs w:val="18"/>
         </w:rPr>
-        <w:t xml:space="preserve">样本分级规则：</w:t>
-      </w:r>
-    </w:p>
-    <w:p>
-      <w:pPr>
-        <w:spacing w:line="276" w:lineRule="auto"/>
-        <w:rPr>
-          <w:rFonts w:ascii="微软雅黑" w:eastAsia="微软雅黑" w:hAnsi="微软雅黑"/>
-          <w:sz w:val="18"/>
-          <w:szCs w:val="18"/>
-        </w:rPr>
-      </w:pPr>
-      <w:r>
-        <w:rPr>
-          <w:rFonts w:ascii="微软雅黑" w:eastAsia="微软雅黑" w:hAnsi="微软雅黑"/>
-          <w:sz w:val="18"/>
-          <w:szCs w:val="18"/>
-        </w:rPr>
-        <w:t xml:space="preserve">若 </w:t>
+        <w:t xml:space="preserve">第一帧 </w:t>
+      </w:r>
+      <m:oMath>
+        <m:box>
+          <m:e>
+            <m:r>
+              <m:rPr>
+                <m:sty m:val="i"/>
+              </m:rPr>
+              <m:t>t</m:t>
+            </m:r>
+            <m:r>
+              <m:rPr>
+                <m:sty m:val="p"/>
+              </m:rPr>
+              <m:t>=</m:t>
+            </m:r>
+            <m:r>
+              <m:rPr>
+                <m:sty m:val="p"/>
+              </m:rPr>
+              <m:t>1</m:t>
+            </m:r>
+          </m:e>
+        </m:box>
+      </m:oMath>
+      <w:r>
+        <w:rPr>
+          <w:rFonts w:ascii="微软雅黑" w:eastAsia="微软雅黑" w:hAnsi="微软雅黑"/>
+          <w:sz w:val="18"/>
+          <w:szCs w:val="18"/>
+        </w:rPr>
+        <w:t xml:space="preserve"> 无历史值，直接以当帧分数初始化 </w:t>
       </w:r>
       <m:oMath>
         <m:box>
@@ -10001,9 +11118,9 @@
               <m:sub>
                 <m:r>
                   <m:rPr>
-                    <m:sty m:val="i"/>
-                  </m:rPr>
-                  <m:t>t</m:t>
+                    <m:sty m:val="p"/>
+                  </m:rPr>
+                  <m:t>1</m:t>
                 </m:r>
               </m:sub>
             </m:sSub>
@@ -10011,7 +11128,7 @@
               <m:rPr>
                 <m:sty m:val="p"/>
               </m:rPr>
-              <m:t>&lt;</m:t>
+              <m:t>=</m:t>
             </m:r>
             <m:sSub>
               <m:e>
@@ -10019,15 +11136,15 @@
                   <m:rPr>
                     <m:sty m:val="i"/>
                   </m:rPr>
-                  <m:t>γ</m:t>
+                  <m:t>Q</m:t>
                 </m:r>
               </m:e>
               <m:sub>
                 <m:r>
                   <m:rPr>
-                    <m:sty m:val="i"/>
-                  </m:rPr>
-                  <m:t>A</m:t>
+                    <m:sty m:val="p"/>
+                  </m:rPr>
+                  <m:t>1</m:t>
                 </m:r>
               </m:sub>
             </m:sSub>
@@ -10040,25 +11157,46 @@
           <w:sz w:val="18"/>
           <w:szCs w:val="18"/>
         </w:rPr>
-        <w:t xml:space="preserve">：A级，可直接入训练集；</w:t>
-      </w:r>
-    </w:p>
-    <w:p>
-      <w:pPr>
-        <w:spacing w:line="276" w:lineRule="auto"/>
-        <w:rPr>
-          <w:rFonts w:ascii="微软雅黑" w:eastAsia="微软雅黑" w:hAnsi="微软雅黑"/>
-          <w:sz w:val="18"/>
-          <w:szCs w:val="18"/>
-        </w:rPr>
-      </w:pPr>
-      <w:r>
-        <w:rPr>
-          <w:rFonts w:ascii="微软雅黑" w:eastAsia="微软雅黑" w:hAnsi="微软雅黑"/>
-          <w:sz w:val="18"/>
-          <w:szCs w:val="18"/>
-        </w:rPr>
-        <w:t xml:space="preserve">若 </w:t>
+        <w:t xml:space="preserve">；平滑系数 </w:t>
+      </w:r>
+      <m:oMath>
+        <m:box>
+          <m:e>
+            <m:r>
+              <m:rPr>
+                <m:sty m:val="i"/>
+              </m:rPr>
+              <m:t>β</m:t>
+            </m:r>
+          </m:e>
+        </m:box>
+      </m:oMath>
+      <w:r>
+        <w:rPr>
+          <w:rFonts w:ascii="微软雅黑" w:eastAsia="微软雅黑" w:hAnsi="微软雅黑"/>
+          <w:sz w:val="18"/>
+          <w:szCs w:val="18"/>
+        </w:rPr>
+        <w:t xml:space="preserve"> 预设（典型 0.3~0.5）。</w:t>
+      </w:r>
+    </w:p>
+    <w:p>
+      <w:pPr>
+        <w:spacing w:line="276" w:lineRule="auto"/>
+        <w:rPr>
+          <w:rFonts w:ascii="微软雅黑" w:eastAsia="微软雅黑" w:hAnsi="微软雅黑"/>
+          <w:sz w:val="18"/>
+          <w:szCs w:val="18"/>
+        </w:rPr>
+        <w:ind w:firstLineChars="200" w:firstLine="420"/>
+      </w:pPr>
+      <w:r>
+        <w:rPr>
+          <w:rFonts w:ascii="微软雅黑" w:eastAsia="微软雅黑" w:hAnsi="微软雅黑"/>
+          <w:sz w:val="18"/>
+          <w:szCs w:val="18"/>
+        </w:rPr>
+        <w:t xml:space="preserve">样本分级规则（</w:t>
       </w:r>
       <m:oMath>
         <m:box>
@@ -10085,46 +11223,6 @@
               <m:rPr>
                 <m:sty m:val="p"/>
               </m:rPr>
-              <m:t>≤</m:t>
-            </m:r>
-            <m:sSub>
-              <m:e>
-                <m:limUpp>
-                  <m:e>
-                    <m:box>
-                      <m:e>
-                        <m:r>
-                          <m:rPr>
-                            <m:sty m:val="i"/>
-                          </m:rPr>
-                          <m:t>Q</m:t>
-                        </m:r>
-                      </m:e>
-                    </m:box>
-                  </m:e>
-                  <m:lim>
-                    <m:r>
-                      <m:rPr>
-                        <m:sty m:val="p"/>
-                      </m:rPr>
-                      <m:t>~</m:t>
-                    </m:r>
-                  </m:lim>
-                </m:limUpp>
-              </m:e>
-              <m:sub>
-                <m:r>
-                  <m:rPr>
-                    <m:sty m:val="i"/>
-                  </m:rPr>
-                  <m:t>t</m:t>
-                </m:r>
-              </m:sub>
-            </m:sSub>
-            <m:r>
-              <m:rPr>
-                <m:sty m:val="p"/>
-              </m:rPr>
               <m:t>&lt;</m:t>
             </m:r>
             <m:sSub>
@@ -10154,7 +11252,131 @@
           <w:sz w:val="18"/>
           <w:szCs w:val="18"/>
         </w:rPr>
-        <w:t xml:space="preserve">：B级，降权参与训练或进入人工抽检池；</w:t>
+        <w:t xml:space="preserve"> 均为预设阈值，在 </w:t>
+      </w:r>
+      <m:oMath>
+        <m:box>
+          <m:e>
+            <m:limUpp>
+              <m:e>
+                <m:box>
+                  <m:e>
+                    <m:r>
+                      <m:rPr>
+                        <m:sty m:val="i"/>
+                      </m:rPr>
+                      <m:t>Q</m:t>
+                    </m:r>
+                  </m:e>
+                </m:box>
+              </m:e>
+              <m:lim>
+                <m:r>
+                  <m:rPr>
+                    <m:sty m:val="p"/>
+                  </m:rPr>
+                  <m:t>~</m:t>
+                </m:r>
+              </m:lim>
+            </m:limUpp>
+          </m:e>
+        </m:box>
+      </m:oMath>
+      <w:r>
+        <w:rPr>
+          <w:rFonts w:ascii="微软雅黑" w:eastAsia="微软雅黑" w:hAnsi="微软雅黑"/>
+          <w:sz w:val="18"/>
+          <w:szCs w:val="18"/>
+        </w:rPr>
+        <w:t xml:space="preserve"> 的取值范围上典型取 </w:t>
+      </w:r>
+      <m:oMath>
+        <m:box>
+          <m:e>
+            <m:sSub>
+              <m:e>
+                <m:r>
+                  <m:rPr>
+                    <m:sty m:val="i"/>
+                  </m:rPr>
+                  <m:t>γ</m:t>
+                </m:r>
+              </m:e>
+              <m:sub>
+                <m:r>
+                  <m:rPr>
+                    <m:sty m:val="i"/>
+                  </m:rPr>
+                  <m:t>A</m:t>
+                </m:r>
+              </m:sub>
+            </m:sSub>
+            <m:r>
+              <m:rPr>
+                <m:sty m:val="p"/>
+              </m:rPr>
+              <m:t>≈</m:t>
+            </m:r>
+            <m:r>
+              <m:rPr>
+                <m:sty m:val="p"/>
+              </m:rPr>
+              <m:t>0.3</m:t>
+            </m:r>
+          </m:e>
+        </m:box>
+      </m:oMath>
+      <w:r>
+        <w:rPr>
+          <w:rFonts w:ascii="微软雅黑" w:eastAsia="微软雅黑" w:hAnsi="微软雅黑"/>
+          <w:sz w:val="18"/>
+          <w:szCs w:val="18"/>
+        </w:rPr>
+        <w:t xml:space="preserve">、</w:t>
+      </w:r>
+      <m:oMath>
+        <m:box>
+          <m:e>
+            <m:sSub>
+              <m:e>
+                <m:r>
+                  <m:rPr>
+                    <m:sty m:val="i"/>
+                  </m:rPr>
+                  <m:t>γ</m:t>
+                </m:r>
+              </m:e>
+              <m:sub>
+                <m:r>
+                  <m:rPr>
+                    <m:sty m:val="i"/>
+                  </m:rPr>
+                  <m:t>B</m:t>
+                </m:r>
+              </m:sub>
+            </m:sSub>
+            <m:r>
+              <m:rPr>
+                <m:sty m:val="p"/>
+              </m:rPr>
+              <m:t>≈</m:t>
+            </m:r>
+            <m:r>
+              <m:rPr>
+                <m:sty m:val="p"/>
+              </m:rPr>
+              <m:t>0.6</m:t>
+            </m:r>
+          </m:e>
+        </m:box>
+      </m:oMath>
+      <w:r>
+        <w:rPr>
+          <w:rFonts w:ascii="微软雅黑" w:eastAsia="微软雅黑" w:hAnsi="微软雅黑"/>
+          <w:sz w:val="18"/>
+          <w:szCs w:val="18"/>
+        </w:rPr>
+        <w:t xml:space="preserve">，可按项目标定）；分级的含义是：蒙皮结果对应的指标分数即作为该蒙皮结果的质量度量（分数低表征质量正常，分数高表征异常）：</w:t>
       </w:r>
     </w:p>
     <w:p>
@@ -10215,6 +11437,210 @@
               <m:rPr>
                 <m:sty m:val="p"/>
               </m:rPr>
+              <m:t>&lt;</m:t>
+            </m:r>
+            <m:sSub>
+              <m:e>
+                <m:r>
+                  <m:rPr>
+                    <m:sty m:val="i"/>
+                  </m:rPr>
+                  <m:t>γ</m:t>
+                </m:r>
+              </m:e>
+              <m:sub>
+                <m:r>
+                  <m:rPr>
+                    <m:sty m:val="i"/>
+                  </m:rPr>
+                  <m:t>A</m:t>
+                </m:r>
+              </m:sub>
+            </m:sSub>
+          </m:e>
+        </m:box>
+      </m:oMath>
+      <w:r>
+        <w:rPr>
+          <w:rFonts w:ascii="微软雅黑" w:eastAsia="微软雅黑" w:hAnsi="微软雅黑"/>
+          <w:sz w:val="18"/>
+          <w:szCs w:val="18"/>
+        </w:rPr>
+        <w:t xml:space="preserve">：A级，可直接入训练集；</w:t>
+      </w:r>
+    </w:p>
+    <w:p>
+      <w:pPr>
+        <w:spacing w:line="276" w:lineRule="auto"/>
+        <w:rPr>
+          <w:rFonts w:ascii="微软雅黑" w:eastAsia="微软雅黑" w:hAnsi="微软雅黑"/>
+          <w:sz w:val="18"/>
+          <w:szCs w:val="18"/>
+        </w:rPr>
+      </w:pPr>
+      <w:r>
+        <w:rPr>
+          <w:rFonts w:ascii="微软雅黑" w:eastAsia="微软雅黑" w:hAnsi="微软雅黑"/>
+          <w:sz w:val="18"/>
+          <w:szCs w:val="18"/>
+        </w:rPr>
+        <w:t xml:space="preserve">若 </w:t>
+      </w:r>
+      <m:oMath>
+        <m:box>
+          <m:e>
+            <m:sSub>
+              <m:e>
+                <m:r>
+                  <m:rPr>
+                    <m:sty m:val="i"/>
+                  </m:rPr>
+                  <m:t>γ</m:t>
+                </m:r>
+              </m:e>
+              <m:sub>
+                <m:r>
+                  <m:rPr>
+                    <m:sty m:val="i"/>
+                  </m:rPr>
+                  <m:t>A</m:t>
+                </m:r>
+              </m:sub>
+            </m:sSub>
+            <m:r>
+              <m:rPr>
+                <m:sty m:val="p"/>
+              </m:rPr>
+              <m:t>≤</m:t>
+            </m:r>
+            <m:sSub>
+              <m:e>
+                <m:limUpp>
+                  <m:e>
+                    <m:box>
+                      <m:e>
+                        <m:r>
+                          <m:rPr>
+                            <m:sty m:val="i"/>
+                          </m:rPr>
+                          <m:t>Q</m:t>
+                        </m:r>
+                      </m:e>
+                    </m:box>
+                  </m:e>
+                  <m:lim>
+                    <m:r>
+                      <m:rPr>
+                        <m:sty m:val="p"/>
+                      </m:rPr>
+                      <m:t>~</m:t>
+                    </m:r>
+                  </m:lim>
+                </m:limUpp>
+              </m:e>
+              <m:sub>
+                <m:r>
+                  <m:rPr>
+                    <m:sty m:val="i"/>
+                  </m:rPr>
+                  <m:t>t</m:t>
+                </m:r>
+              </m:sub>
+            </m:sSub>
+            <m:r>
+              <m:rPr>
+                <m:sty m:val="p"/>
+              </m:rPr>
+              <m:t>&lt;</m:t>
+            </m:r>
+            <m:sSub>
+              <m:e>
+                <m:r>
+                  <m:rPr>
+                    <m:sty m:val="i"/>
+                  </m:rPr>
+                  <m:t>γ</m:t>
+                </m:r>
+              </m:e>
+              <m:sub>
+                <m:r>
+                  <m:rPr>
+                    <m:sty m:val="i"/>
+                  </m:rPr>
+                  <m:t>B</m:t>
+                </m:r>
+              </m:sub>
+            </m:sSub>
+          </m:e>
+        </m:box>
+      </m:oMath>
+      <w:r>
+        <w:rPr>
+          <w:rFonts w:ascii="微软雅黑" w:eastAsia="微软雅黑" w:hAnsi="微软雅黑"/>
+          <w:sz w:val="18"/>
+          <w:szCs w:val="18"/>
+        </w:rPr>
+        <w:t xml:space="preserve">：B级，降权参与训练或进入人工抽检池；</w:t>
+      </w:r>
+    </w:p>
+    <w:p>
+      <w:pPr>
+        <w:spacing w:line="276" w:lineRule="auto"/>
+        <w:rPr>
+          <w:rFonts w:ascii="微软雅黑" w:eastAsia="微软雅黑" w:hAnsi="微软雅黑"/>
+          <w:sz w:val="18"/>
+          <w:szCs w:val="18"/>
+        </w:rPr>
+      </w:pPr>
+      <w:r>
+        <w:rPr>
+          <w:rFonts w:ascii="微软雅黑" w:eastAsia="微软雅黑" w:hAnsi="微软雅黑"/>
+          <w:sz w:val="18"/>
+          <w:szCs w:val="18"/>
+        </w:rPr>
+        <w:t xml:space="preserve">若 </w:t>
+      </w:r>
+      <m:oMath>
+        <m:box>
+          <m:e>
+            <m:sSub>
+              <m:e>
+                <m:limUpp>
+                  <m:e>
+                    <m:box>
+                      <m:e>
+                        <m:r>
+                          <m:rPr>
+                            <m:sty m:val="i"/>
+                          </m:rPr>
+                          <m:t>Q</m:t>
+                        </m:r>
+                      </m:e>
+                    </m:box>
+                  </m:e>
+                  <m:lim>
+                    <m:r>
+                      <m:rPr>
+                        <m:sty m:val="p"/>
+                      </m:rPr>
+                      <m:t>~</m:t>
+                    </m:r>
+                  </m:lim>
+                </m:limUpp>
+              </m:e>
+              <m:sub>
+                <m:r>
+                  <m:rPr>
+                    <m:sty m:val="i"/>
+                  </m:rPr>
+                  <m:t>t</m:t>
+                </m:r>
+              </m:sub>
+            </m:sSub>
+            <m:r>
+              <m:rPr>
+                <m:sty m:val="p"/>
+              </m:rPr>
               <m:t>≥</m:t>
             </m:r>
             <m:sSub>
@@ -10349,35 +11775,11 @@
           <w:sz w:val="18"/>
           <w:szCs w:val="18"/>
         </w:rPr>
-        <w:t xml:space="preserve"> 的顶点/面片汇总，在拓扑图上执行广度优先或并查集连通域聚类，得到区域级定位结果。具体聚类流程：首先标记所有至少一项指标 </w:t>
+        <w:t xml:space="preserve"> 的顶点/面片汇总，在拓扑图上执行广度优先或并查集连通域聚类，得到区域级定位结果。其中 </w:t>
       </w:r>
       <m:oMath>
         <m:box>
           <m:e>
-            <m:sSub>
-              <m:e>
-                <m:r>
-                  <m:rPr>
-                    <m:sty m:val="i"/>
-                  </m:rPr>
-                  <m:t>z</m:t>
-                </m:r>
-              </m:e>
-              <m:sub>
-                <m:r>
-                  <m:rPr>
-                    <m:sty m:val="i"/>
-                  </m:rPr>
-                  <m:t>i</m:t>
-                </m:r>
-              </m:sub>
-            </m:sSub>
-            <m:r>
-              <m:rPr>
-                <m:sty m:val="p"/>
-              </m:rPr>
-              <m:t>≥</m:t>
-            </m:r>
             <m:sSubSup>
               <m:e>
                 <m:r>
@@ -10417,7 +11819,51 @@
           <w:sz w:val="18"/>
           <w:szCs w:val="18"/>
         </w:rPr>
-        <w:t xml:space="preserve"> 的顶点为异常元素；在网格拓扑上仅保留异常元素间的边构建异常子图 </w:t>
+        <w:t xml:space="preserve"> 为预设的定位触发阈值（在归一化分数 </w:t>
+      </w:r>
+      <m:oMath>
+        <m:box>
+          <m:e>
+            <m:r>
+              <m:rPr>
+                <m:sty m:val="p"/>
+              </m:rPr>
+              <m:t>[</m:t>
+            </m:r>
+            <m:r>
+              <m:rPr>
+                <m:sty m:val="p"/>
+              </m:rPr>
+              <m:t>0</m:t>
+            </m:r>
+            <m:r>
+              <m:rPr>
+                <m:sty m:val="p"/>
+              </m:rPr>
+              <m:t>,</m:t>
+            </m:r>
+            <m:r>
+              <m:rPr>
+                <m:sty m:val="p"/>
+              </m:rPr>
+              <m:t>1</m:t>
+            </m:r>
+            <m:r>
+              <m:rPr>
+                <m:sty m:val="p"/>
+              </m:rPr>
+              <m:t>]</m:t>
+            </m:r>
+          </m:e>
+        </m:box>
+      </m:oMath>
+      <w:r>
+        <w:rPr>
+          <w:rFonts w:ascii="微软雅黑" w:eastAsia="微软雅黑" w:hAnsi="微软雅黑"/>
+          <w:sz w:val="18"/>
+          <w:szCs w:val="18"/>
+        </w:rPr>
+        <w:t xml:space="preserve"> 上典型取 0.5，可按指标单独配置，一般略低于分级阈值以便尽早捕获异常元素）。具体聚类流程：首先标记所有至少一项指标 </w:t>
       </w:r>
       <m:oMath>
         <m:box>
@@ -10428,6 +11874,74 @@
                   <m:rPr>
                     <m:sty m:val="i"/>
                   </m:rPr>
+                  <m:t>z</m:t>
+                </m:r>
+              </m:e>
+              <m:sub>
+                <m:r>
+                  <m:rPr>
+                    <m:sty m:val="i"/>
+                  </m:rPr>
+                  <m:t>i</m:t>
+                </m:r>
+              </m:sub>
+            </m:sSub>
+            <m:r>
+              <m:rPr>
+                <m:sty m:val="p"/>
+              </m:rPr>
+              <m:t>≥</m:t>
+            </m:r>
+            <m:sSubSup>
+              <m:e>
+                <m:r>
+                  <m:rPr>
+                    <m:sty m:val="i"/>
+                  </m:rPr>
+                  <m:t>τ</m:t>
+                </m:r>
+              </m:e>
+              <m:sub>
+                <m:r>
+                  <m:rPr>
+                    <m:sty m:val="i"/>
+                  </m:rPr>
+                  <m:t>i</m:t>
+                </m:r>
+              </m:sub>
+              <m:sup>
+                <m:box>
+                  <m:e>
+                    <m:r>
+                      <m:rPr>
+                        <m:nor/>
+                      </m:rPr>
+                      <m:t>loc</m:t>
+                    </m:r>
+                  </m:e>
+                </m:box>
+              </m:sup>
+            </m:sSubSup>
+          </m:e>
+        </m:box>
+      </m:oMath>
+      <w:r>
+        <w:rPr>
+          <w:rFonts w:ascii="微软雅黑" w:eastAsia="微软雅黑" w:hAnsi="微软雅黑"/>
+          <w:sz w:val="18"/>
+          <w:szCs w:val="18"/>
+        </w:rPr>
+        <w:t xml:space="preserve"> 的顶点为异常元素；在网格拓扑上仅保留异常元素间的边构建异常子图 </w:t>
+      </w:r>
+      <m:oMath>
+        <m:box>
+          <m:e>
+            <m:sSub>
+              <m:e>
+                <m:r>
+                  <m:rPr>
+                    <m:sty m:val="i"/>
+                  </m:rPr>
                   <m:t>𝒢</m:t>
                 </m:r>
               </m:e>
@@ -10545,43 +12059,80 @@
           <w:sz w:val="18"/>
           <w:szCs w:val="18"/>
         </w:rPr>
-        <w:t xml:space="preserve"> 反推主要责任骨骼簇——取域内顶点权重均值，选权重贡献前3的骨骼作为责任骨骼。生成可解释报告，内容包括：</w:t>
-      </w:r>
-    </w:p>
-    <w:p>
-      <w:pPr>
-        <w:spacing w:line="276" w:lineRule="auto"/>
-        <w:rPr>
-          <w:rFonts w:ascii="微软雅黑" w:eastAsia="微软雅黑" w:hAnsi="微软雅黑"/>
-          <w:sz w:val="18"/>
-          <w:szCs w:val="18"/>
-        </w:rPr>
-      </w:pPr>
-      <w:r>
-        <w:rPr>
-          <w:rFonts w:ascii="微软雅黑" w:eastAsia="微软雅黑" w:hAnsi="微软雅黑"/>
-          <w:sz w:val="18"/>
-          <w:szCs w:val="18"/>
-        </w:rPr>
-        <w:t xml:space="preserve">1. 异常类型及严重度排序（按域内峰值分数降序）；</w:t>
-      </w:r>
-    </w:p>
-    <w:p>
-      <w:pPr>
-        <w:spacing w:line="276" w:lineRule="auto"/>
-        <w:rPr>
-          <w:rFonts w:ascii="微软雅黑" w:eastAsia="微软雅黑" w:hAnsi="微软雅黑"/>
-          <w:sz w:val="18"/>
-          <w:szCs w:val="18"/>
-        </w:rPr>
-      </w:pPr>
-      <w:r>
-        <w:rPr>
-          <w:rFonts w:ascii="微软雅黑" w:eastAsia="微软雅黑" w:hAnsi="微软雅黑"/>
-          <w:sz w:val="18"/>
-          <w:szCs w:val="18"/>
-        </w:rPr>
-        <w:t xml:space="preserve">2. 区域3D边界框、异常面积占比与时间片段 </w:t>
+        <w:t xml:space="preserve">（即 §3.2.1 的蒙皮权重矩阵，按连通域内各顶点对应的蒙皮权重）反推主要责任骨骼簇——取域内顶点蒙皮权重的均值，选权重贡献前3的骨骼作为责任骨骼。</w:t>
+      </w:r>
+    </w:p>
+    <w:p>
+      <w:pPr>
+        <w:spacing w:line="276" w:lineRule="auto"/>
+        <w:rPr>
+          <w:rFonts w:ascii="微软雅黑" w:eastAsia="微软雅黑" w:hAnsi="微软雅黑"/>
+          <w:sz w:val="18"/>
+          <w:szCs w:val="18"/>
+        </w:rPr>
+        <w:ind w:firstLineChars="200" w:firstLine="420"/>
+      </w:pPr>
+      <w:r>
+        <w:rPr>
+          <w:rFonts w:ascii="微软雅黑" w:eastAsia="微软雅黑" w:hAnsi="微软雅黑"/>
+          <w:sz w:val="18"/>
+          <w:szCs w:val="18"/>
+        </w:rPr>
+        <w:t xml:space="preserve">基于上述连通域与责任骨骼，生成</w:t>
+      </w:r>
+      <w:r>
+        <w:rPr>
+          <w:rFonts w:ascii="微软雅黑" w:eastAsia="微软雅黑" w:hAnsi="微软雅黑"/>
+          <w:sz w:val="18"/>
+          <w:szCs w:val="18"/>
+          <w:b/>
+          <w:bCs/>
+        </w:rPr>
+        <w:t xml:space="preserve">可解释报告</w:t>
+      </w:r>
+      <w:r>
+        <w:rPr>
+          <w:rFonts w:ascii="微软雅黑" w:eastAsia="微软雅黑" w:hAnsi="微软雅黑"/>
+          <w:sz w:val="18"/>
+          <w:szCs w:val="18"/>
+        </w:rPr>
+        <w:t xml:space="preserve">（即下述5条内容；报告由系统自动汇编：把每个连通域的统计量、触发的指标与规则路径、责任骨骼按模板填充输出，无需人工撰写。如需更详细的报告生成与可视化细节，可另行电话会议沟通），内容包括：</w:t>
+      </w:r>
+    </w:p>
+    <w:p>
+      <w:pPr>
+        <w:spacing w:line="276" w:lineRule="auto"/>
+        <w:rPr>
+          <w:rFonts w:ascii="微软雅黑" w:eastAsia="微软雅黑" w:hAnsi="微软雅黑"/>
+          <w:sz w:val="18"/>
+          <w:szCs w:val="18"/>
+        </w:rPr>
+      </w:pPr>
+      <w:r>
+        <w:rPr>
+          <w:rFonts w:ascii="微软雅黑" w:eastAsia="微软雅黑" w:hAnsi="微软雅黑"/>
+          <w:sz w:val="18"/>
+          <w:szCs w:val="18"/>
+        </w:rPr>
+        <w:t xml:space="preserve">1. 异常类型及严重度排序（异常类型即对应触发的异常指标，如穿插/粘连/共线；排序为：同一帧内对各连通域（每个连通域对应一个骨骼影响域）按其域内峰值分数降序排列）；</w:t>
+      </w:r>
+    </w:p>
+    <w:p>
+      <w:pPr>
+        <w:spacing w:line="276" w:lineRule="auto"/>
+        <w:rPr>
+          <w:rFonts w:ascii="微软雅黑" w:eastAsia="微软雅黑" w:hAnsi="微软雅黑"/>
+          <w:sz w:val="18"/>
+          <w:szCs w:val="18"/>
+        </w:rPr>
+      </w:pPr>
+      <w:r>
+        <w:rPr>
+          <w:rFonts w:ascii="微软雅黑" w:eastAsia="微软雅黑" w:hAnsi="微软雅黑"/>
+          <w:sz w:val="18"/>
+          <w:szCs w:val="18"/>
+        </w:rPr>
+        <w:t xml:space="preserve">2. 区域3D边界框（空间维度）、异常面积占比（该区域占该部位/全网格的面积比例）与时间片段 </w:t>
       </w:r>
       <m:oMath>
         <m:box>
@@ -10657,7 +12208,7 @@
           <w:sz w:val="18"/>
           <w:szCs w:val="18"/>
         </w:rPr>
-        <w:t xml:space="preserve">；</w:t>
+        <w:t xml:space="preserve">（时间维度，即该异常持续的帧区间）；</w:t>
       </w:r>
     </w:p>
     <w:p>
@@ -10711,7 +12262,7 @@
           <w:sz w:val="18"/>
           <w:szCs w:val="18"/>
         </w:rPr>
-        <w:t xml:space="preserve">5. 建议处理动作（剔除/降权/修复）及预估训练收益。</w:t>
+        <w:t xml:space="preserve">5. 建议处理动作（剔除/降权/修复）及预估训练收益（即采纳该动作后预期对训练数据分布改善的量级，如该类异常占比下降的估计值）。</w:t>
       </w:r>
     </w:p>
     <w:p>
@@ -10882,7 +12433,27 @@
           <w:sz w:val="18"/>
           <w:szCs w:val="18"/>
         </w:rPr>
-        <w:t xml:space="preserve">。在训练数据加载器中，B级样本的损失函数乘以该降权系数：</w:t>
+        <w:t xml:space="preserve">，其中 </w:t>
+      </w:r>
+      <m:oMath>
+        <m:box>
+          <m:e>
+            <m:r>
+              <m:rPr>
+                <m:sty m:val="i"/>
+              </m:rPr>
+              <m:t>ϵ</m:t>
+            </m:r>
+          </m:e>
+        </m:box>
+      </m:oMath>
+      <w:r>
+        <w:rPr>
+          <w:rFonts w:ascii="微软雅黑" w:eastAsia="微软雅黑" w:hAnsi="微软雅黑"/>
+          <w:sz w:val="18"/>
+          <w:szCs w:val="18"/>
+        </w:rPr>
+        <w:t xml:space="preserve"> 为预设的最小权重下限（防止样本权重归零被完全丢弃，典型取 0.05~0.1）。在训练数据加载器中，B级样本的损失函数乘以该降权系数：</w:t>
       </w:r>
       <m:oMath>
         <m:box>
@@ -10919,6 +12490,7 @@
               <m:naryPr>
                 <m:chr m:val="∑"/>
                 <m:limLoc m:val="undOvr"/>
+                <m:supHide m:val="1"/>
               </m:naryPr>
               <m:sub>
                 <m:box>
@@ -10970,7 +12542,7 @@
                 </m:sSub>
                 <m:r>
                   <m:rPr>
-                    <m:sty m:val="p"/>
+                    <m:sty m:val="i"/>
                   </m:rPr>
                   <m:t>·</m:t>
                 </m:r>
@@ -11061,7 +12633,97 @@
           <w:sz w:val="18"/>
           <w:szCs w:val="18"/>
         </w:rPr>
-        <w:t xml:space="preserve">，实现样本级损失调制。</w:t>
+        <w:t xml:space="preserve">，实现样本级损失调制。此处 </w:t>
+      </w:r>
+      <m:oMath>
+        <m:box>
+          <m:e>
+            <m:r>
+              <m:rPr>
+                <m:sty m:val="i"/>
+              </m:rPr>
+              <m:t>ℓ</m:t>
+            </m:r>
+            <m:r>
+              <m:rPr>
+                <m:sty m:val="p"/>
+              </m:rPr>
+              <m:t>(</m:t>
+            </m:r>
+            <m:sSub>
+              <m:e>
+                <m:limUpp>
+                  <m:e>
+                    <m:box>
+                      <m:e>
+                        <m:r>
+                          <m:rPr>
+                            <m:sty m:val="i"/>
+                          </m:rPr>
+                          <m:t>y</m:t>
+                        </m:r>
+                      </m:e>
+                    </m:box>
+                  </m:e>
+                  <m:lim>
+                    <m:r>
+                      <m:rPr>
+                        <m:sty m:val="p"/>
+                      </m:rPr>
+                      <m:t>^</m:t>
+                    </m:r>
+                  </m:lim>
+                </m:limUpp>
+              </m:e>
+              <m:sub>
+                <m:r>
+                  <m:rPr>
+                    <m:sty m:val="i"/>
+                  </m:rPr>
+                  <m:t>j</m:t>
+                </m:r>
+              </m:sub>
+            </m:sSub>
+            <m:r>
+              <m:rPr>
+                <m:sty m:val="p"/>
+              </m:rPr>
+              <m:t>,</m:t>
+            </m:r>
+            <m:sSub>
+              <m:e>
+                <m:r>
+                  <m:rPr>
+                    <m:sty m:val="i"/>
+                  </m:rPr>
+                  <m:t>y</m:t>
+                </m:r>
+              </m:e>
+              <m:sub>
+                <m:r>
+                  <m:rPr>
+                    <m:sty m:val="i"/>
+                  </m:rPr>
+                  <m:t>j</m:t>
+                </m:r>
+              </m:sub>
+            </m:sSub>
+            <m:r>
+              <m:rPr>
+                <m:sty m:val="p"/>
+              </m:rPr>
+              <m:t>)</m:t>
+            </m:r>
+          </m:e>
+        </m:box>
+      </m:oMath>
+      <w:r>
+        <w:rPr>
+          <w:rFonts w:ascii="微软雅黑" w:eastAsia="微软雅黑" w:hAnsi="微软雅黑"/>
+          <w:sz w:val="18"/>
+          <w:szCs w:val="18"/>
+        </w:rPr>
+        <w:t xml:space="preserve"> 为蒙皮模型原有的训练损失，举例如蒙皮权重回归的 L1/L2 损失、权重分布的 KL 散度或重建顶点位置的均方误差等，本发明不改变其形式、仅对其按样本质量加权。</w:t>
       </w:r>
     </w:p>
     <w:p>
@@ -11125,7 +12787,7 @@
           <w:sz w:val="18"/>
           <w:szCs w:val="18"/>
         </w:rPr>
-        <w:t xml:space="preserve">）自动归档至难例池，池容量上限为 </w:t>
+        <w:t xml:space="preserve">，此处"触发率"指该异常类型在评估样本中被判定为异常的样本比例，并非降权比例）自动归档至难例池，池容量上限为 </w:t>
       </w:r>
       <m:oMath>
         <m:box>
@@ -11229,18 +12891,8 @@
           <w:sz w:val="18"/>
           <w:szCs w:val="18"/>
         </w:rPr>
-        <w:t xml:space="preserve"> 降序采样），触发定向微调。</w:t>
-      </w:r>
-    </w:p>
-    <w:p>
-      <w:pPr>
-        <w:spacing w:line="276" w:lineRule="auto"/>
-        <w:rPr>
-          <w:rFonts w:ascii="微软雅黑" w:eastAsia="微软雅黑" w:hAnsi="微软雅黑"/>
-          <w:sz w:val="18"/>
-          <w:szCs w:val="18"/>
-        </w:rPr>
-      </w:pPr>
+        <w:t xml:space="preserve"> 降序采样），触发定向微调。定向微调时对难例池样本可相应</w:t>
+      </w:r>
       <w:r>
         <w:rPr>
           <w:rFonts w:ascii="微软雅黑" w:eastAsia="微软雅黑" w:hAnsi="微软雅黑"/>
@@ -11249,6 +12901,34 @@
           <w:b/>
           <w:bCs/>
         </w:rPr>
+        <w:t xml:space="preserve">提高其损失权重</w:t>
+      </w:r>
+      <w:r>
+        <w:rPr>
+          <w:rFonts w:ascii="微软雅黑" w:eastAsia="微软雅黑" w:hAnsi="微软雅黑"/>
+          <w:sz w:val="18"/>
+          <w:szCs w:val="18"/>
+        </w:rPr>
+        <w:t xml:space="preserve">（与上述降权相反，即对难例做过采样或上调权重），使模型重点学习这些高频异常。</w:t>
+      </w:r>
+    </w:p>
+    <w:p>
+      <w:pPr>
+        <w:spacing w:line="276" w:lineRule="auto"/>
+        <w:rPr>
+          <w:rFonts w:ascii="微软雅黑" w:eastAsia="微软雅黑" w:hAnsi="微软雅黑"/>
+          <w:sz w:val="18"/>
+          <w:szCs w:val="18"/>
+        </w:rPr>
+      </w:pPr>
+      <w:r>
+        <w:rPr>
+          <w:rFonts w:ascii="微软雅黑" w:eastAsia="微软雅黑" w:hAnsi="微软雅黑"/>
+          <w:sz w:val="18"/>
+          <w:szCs w:val="18"/>
+          <w:b/>
+          <w:bCs/>
+        </w:rPr>
         <w:t xml:space="preserve">回归验证</w:t>
       </w:r>
       <w:r>
@@ -11257,7 +12937,25 @@
           <w:sz w:val="18"/>
           <w:szCs w:val="18"/>
         </w:rPr>
-        <w:t xml:space="preserve"> ：新模型或新规则上线前，在回归基线集（从历史A级样本中固定抽取的 </w:t>
+        <w:t xml:space="preserve"> ：新模型或新规则上线前进行回归验证。这里的"新模型"即前述被训练联动的</w:t>
+      </w:r>
+      <w:r>
+        <w:rPr>
+          <w:rFonts w:ascii="微软雅黑" w:eastAsia="微软雅黑" w:hAnsi="微软雅黑"/>
+          <w:sz w:val="18"/>
+          <w:szCs w:val="18"/>
+          <w:b/>
+          <w:bCs/>
+        </w:rPr>
+        <w:t xml:space="preserve">自动蒙皮AI模型</w:t>
+      </w:r>
+      <w:r>
+        <w:rPr>
+          <w:rFonts w:ascii="微软雅黑" w:eastAsia="微软雅黑" w:hAnsi="微软雅黑"/>
+          <w:sz w:val="18"/>
+          <w:szCs w:val="18"/>
+        </w:rPr>
+        <w:t xml:space="preserve">的新版本（也包括纯规则更新的情形）。在回归基线集（从历史A级样本中固定抽取的 </w:t>
       </w:r>
       <m:oMath>
         <m:box>
@@ -11293,7 +12991,25 @@
           <w:sz w:val="18"/>
           <w:szCs w:val="18"/>
         </w:rPr>
-        <w:t xml:space="preserve"> 个标准样本）上计算各指标分布。采用Kolmogorov-Smirnov检验统计量 </w:t>
+        <w:t xml:space="preserve"> 个标准样本）上，用本发明评估引擎对新模型输出计算各指标分数，得到每个指标的</w:t>
+      </w:r>
+      <w:r>
+        <w:rPr>
+          <w:rFonts w:ascii="微软雅黑" w:eastAsia="微软雅黑" w:hAnsi="微软雅黑"/>
+          <w:sz w:val="18"/>
+          <w:szCs w:val="18"/>
+          <w:b/>
+          <w:bCs/>
+        </w:rPr>
+        <w:t xml:space="preserve">分数分布</w:t>
+      </w:r>
+      <w:r>
+        <w:rPr>
+          <w:rFonts w:ascii="微软雅黑" w:eastAsia="微软雅黑" w:hAnsi="微软雅黑"/>
+          <w:sz w:val="18"/>
+          <w:szCs w:val="18"/>
+        </w:rPr>
+        <w:t xml:space="preserve">（即该指标在基线集若干样本上取值的经验分布/直方图），与历史基线分布作对比。采用Kolmogorov-Smirnov检验统计量 </w:t>
       </w:r>
       <m:oMath>
         <m:box>
@@ -11329,7 +13045,7 @@
           <w:sz w:val="18"/>
           <w:szCs w:val="18"/>
         </w:rPr>
-        <w:t xml:space="preserve"> 或均值偏移量 </w:t>
+        <w:t xml:space="preserve">（衡量两个分布的最大累积偏离）或均值偏移量 </w:t>
       </w:r>
       <m:oMath>
         <m:box>
@@ -11695,7 +13411,7 @@
           <w:sz w:val="18"/>
           <w:szCs w:val="18"/>
         </w:rPr>
-        <w:t xml:space="preserve">；若漏检率偏高，则提高 </w:t>
+        <w:t xml:space="preserve">；若漏检率偏高（即真实存在异常却被该指标判为正常、漏过的比例偏高），则提高 </w:t>
       </w:r>
       <m:oMath>
         <m:box>
@@ -11771,61 +13487,7 @@
           <w:sz w:val="18"/>
           <w:szCs w:val="18"/>
         </w:rPr>
-        <w:t xml:space="preserve">。所有调整以语义化版本号发布并记录变更日志。</w:t>
-      </w:r>
-    </w:p>
-    <w:p>
-      <w:pPr>
-        <w:jc w:val="center"/>
-      </w:pPr>
-      <w:r>
-        <w:drawing>
-          <wp:inline distT="0" distB="0" distL="0" distR="0">
-            <wp:extent cx="4572000" cy="2493818"/>
-            <wp:effectExtent l="0" t="0" r="0" b="0"/>
-            <wp:docPr id="14" name="Picture 14"/>
-            <wp:cNvGraphicFramePr>
-              <a:graphicFrameLocks xmlns:a="http://schemas.openxmlformats.org/drawingml/2006/main" noChangeAspect="1"/>
-            </wp:cNvGraphicFramePr>
-            <a:graphic xmlns:a="http://schemas.openxmlformats.org/drawingml/2006/main">
-              <a:graphicData uri="http://schemas.openxmlformats.org/drawingml/2006/picture">
-                <pic:pic xmlns:pic="http://schemas.openxmlformats.org/drawingml/2006/picture">
-                  <pic:nvPicPr>
-                    <pic:cNvPr id="14" name="image4.png"/>
-                    <pic:cNvPicPr/>
-                  </pic:nvPicPr>
-                  <pic:blipFill>
-                    <a:blip r:embed="rId19"/>
-                    <a:stretch>
-                      <a:fillRect/>
-                    </a:stretch>
-                  </pic:blipFill>
-                  <pic:spPr>
-                    <a:xfrm>
-                      <a:off x="0" y="0"/>
-                      <a:ext cx="4572000" cy="2493818"/>
-                    </a:xfrm>
-                    <a:prstGeom prst="rect">
-                      <a:avLst/>
-                    </a:prstGeom>
-                  </pic:spPr>
-                </pic:pic>
-              </a:graphicData>
-            </a:graphic>
-          </wp:inline>
-        </w:drawing>
-      </w:r>
-    </w:p>
-    <w:p>
-      <w:pPr>
-        <w:jc w:val="center"/>
-      </w:pPr>
-      <w:r>
-        <w:rPr>
-          <w:sz w:val="18"/>
-          <w:szCs w:val="18"/>
-        </w:rPr>
-        <w:t>图4 数据闭环迭代流程图</w:t>
+        <w:t xml:space="preserve">。所有调整以语义化版本号（SemVer，形如"主版本.次版本.修订号"，记录每次阈值/权重调整信息）发布并记录变更日志。</w:t>
       </w:r>
     </w:p>
     <w:p>
@@ -11985,7 +13647,7 @@
           <w:sz w:val="18"/>
           <w:szCs w:val="18"/>
         </w:rPr>
-        <w:t xml:space="preserve">指标计算结果以统一JSON Schema存储，每条记录包含 `sample_id`、`frame_range`、`metric_scores`（分项分数字典）、`quality_grade`、`anomaly_regions`（连通域列表）和 `rule_version` 等字段，支持与主流数据分析及可视化平台对接。</w:t>
+        <w:t xml:space="preserve">指标计算结果以统一JSON Schema存储，每条记录包含 `sample_id`（样本标识）、`frame_range`（帧区间）、`metric_scores`（分项分数字典）、`quality_grade`（质量等级，即A/B/C级）、`anomaly_regions`（连通域列表）和 `rule_version`（规则版本号）等字段，支持与主流数据分析及可视化平台对接。</w:t>
       </w:r>
     </w:p>
     <w:p>
@@ -12014,7 +13676,7 @@
           <w:sz w:val="18"/>
           <w:szCs w:val="18"/>
         </w:rPr>
-        <w:t xml:space="preserve">每个指标插件需实现标准接口 `compute(mesh_data, config) → MetricResult`，其中 `MetricResult` 包含 `score`、`localization`、`metadata` 三个字段。新增指标只需实现该接口并注册至插件中心，支持条件触发（如仅在穿插指标超阈值后才触发粘连指标的精细计算）。</w:t>
+        <w:t xml:space="preserve">每个指标插件需实现标准接口 `compute(mesh_data, config) → MetricResult`，其中 `mesh_data` 为输入网格数据、`config` 为配置参数，返回的 `MetricResult`（指标结果）包含 `score`（得分）、`localization`（定位信息）、`metadata`（元数据）三个字段。新增指标只需实现该接口并注册至插件中心，支持条件触发（如仅在穿插指标超阈值后才触发粘连指标的精细计算）。</w:t>
       </w:r>
     </w:p>
     <w:p>
@@ -12043,7 +13705,7 @@
           <w:sz w:val="18"/>
           <w:szCs w:val="18"/>
         </w:rPr>
-        <w:t xml:space="preserve">规则、阈值与聚合权重均以语义化版本号（SemVer）管理，每次变更生成差异摘要。历史评估结果可按 `rule_version` 字段回溯当时使用的完整配置集合，支持全链路审计。</w:t>
+        <w:t xml:space="preserve">规则、阈值与聚合权重均以语义化版本号（SemVer）管理，每次变更（即阈值、权重等配置的调整信息）生成差异摘要。历史评估结果可按 `rule_version` 字段回溯当时使用的完整配置集合，支持全链路审计。</w:t>
       </w:r>
     </w:p>
     <w:p>
@@ -12433,7 +14095,7 @@
           <w:sz w:val="18"/>
           <w:szCs w:val="18"/>
         </w:rPr>
-        <w:t xml:space="preserve">加权和聚合可替换为规则树（按优先级顺序判断）、学习排序器（LTR）或贝叶斯融合器，只要保持输出质量分级与可解释路径的特性，均属于本发明的扩展范围。</w:t>
+        <w:t xml:space="preserve">加权和聚合可替换为规则树（按优先级顺序判断）、学习排序器（LTR）或贝叶斯融合器，只要保持输出质量分级与可解释路径的特性，均属于本发明的扩展范围。需说明的是，规则树、LTR、贝叶斯融合器本身均为现有的通用算法，本发明并不主张这些算法本身，而是主张"将其作为可替换的聚合器嵌入本无GT评估闭环、维持质量分级与可解释路径"这一集成方式。</w:t>
       </w:r>
     </w:p>
     <w:p>
@@ -12472,7 +14134,7 @@
           <w:sz w:val="18"/>
           <w:szCs w:val="18"/>
         </w:rPr>
-        <w:t xml:space="preserve">固定阈值可替换为基于滑动窗口的漂移感知阈值，或利用Isolation Forest、MAD等统计方法的自适应离群点阈值，以适配数据分布动态变化的场景。</w:t>
+        <w:t xml:space="preserve">固定阈值可替换为基于滑动窗口的漂移感知阈值，或利用Isolation Forest、MAD等统计方法的自适应离群点阈值，以适配数据分布动态变化的场景。其中Isolation Forest、MAD（中位数绝对偏差）等同样为现有统计方法，本发明主张的是"将其作为阈值生成模块接入本评估闭环以替代固定阈值"的集成应用，而非这些统计方法本身。</w:t>
       </w:r>
     </w:p>
     <w:p>
@@ -12511,18 +14173,8 @@
           <w:sz w:val="18"/>
           <w:szCs w:val="18"/>
         </w:rPr>
-        <w:t xml:space="preserve">可按业务需求增减指标，如添加体积保持指标、骨骼驱动冲突指标、碰撞持续时长指标等；也可将本发明现有指标替换为更精细的计算版本，前提是保持插件化接口不变。</w:t>
-      </w:r>
-    </w:p>
-    <w:p>
-      <w:pPr>
-        <w:spacing w:line="276" w:lineRule="auto"/>
-        <w:rPr>
-          <w:rFonts w:ascii="微软雅黑" w:eastAsia="微软雅黑" w:hAnsi="微软雅黑"/>
-          <w:sz w:val="18"/>
-          <w:szCs w:val="18"/>
-        </w:rPr>
-      </w:pPr>
+        <w:t xml:space="preserve">可按业务需求增减指标，如添加体积保持指标、骨骼驱动冲突指标、碰撞持续时长指标等；也可将本发明现有指标替换为更精细的计算版本，前提是保持插件化接口不变。上述三类补充指标的含义为：</w:t>
+      </w:r>
       <w:r>
         <w:rPr>
           <w:rFonts w:ascii="微软雅黑" w:eastAsia="微软雅黑" w:hAnsi="微软雅黑"/>
@@ -12531,37 +14183,16 @@
           <w:b/>
           <w:bCs/>
         </w:rPr>
-        <w:t xml:space="preserve">替代方案四：闭环动作替代</w:t>
-      </w:r>
-    </w:p>
-    <w:p>
-      <w:pPr>
-        <w:spacing w:line="276" w:lineRule="auto"/>
-        <w:rPr>
-          <w:rFonts w:ascii="微软雅黑" w:eastAsia="微软雅黑" w:hAnsi="微软雅黑"/>
-          <w:sz w:val="18"/>
-          <w:szCs w:val="18"/>
-        </w:rPr>
-        <w:ind w:firstLineChars="200" w:firstLine="420"/>
-      </w:pPr>
-      <w:r>
-        <w:rPr>
-          <w:rFonts w:ascii="微软雅黑" w:eastAsia="微软雅黑" w:hAnsi="微软雅黑"/>
-          <w:sz w:val="18"/>
-          <w:szCs w:val="18"/>
-        </w:rPr>
-        <w:t xml:space="preserve">"剔除"动作可替换为"修复任务自动派发"（触发专利5的后处理算子），"降权"动作可替换为"课程式采样权重调度"，以适配不同训练框架的数据加载策略。</w:t>
-      </w:r>
-    </w:p>
-    <w:p>
-      <w:pPr>
-        <w:spacing w:line="276" w:lineRule="auto"/>
-        <w:rPr>
-          <w:rFonts w:ascii="微软雅黑" w:eastAsia="微软雅黑" w:hAnsi="微软雅黑"/>
-          <w:sz w:val="18"/>
-          <w:szCs w:val="18"/>
-        </w:rPr>
-      </w:pPr>
+        <w:t xml:space="preserve">体积保持指标</w:t>
+      </w:r>
+      <w:r>
+        <w:rPr>
+          <w:rFonts w:ascii="微软雅黑" w:eastAsia="微软雅黑" w:hAnsi="微软雅黑"/>
+          <w:sz w:val="18"/>
+          <w:szCs w:val="18"/>
+        </w:rPr>
+        <w:t xml:space="preserve">——变形后部位网格体积相对绑定姿态体积的变化率，衡量皮肤在蒙皮中是否被不自然地压扁或膨胀；</w:t>
+      </w:r>
       <w:r>
         <w:rPr>
           <w:rFonts w:ascii="微软雅黑" w:eastAsia="微软雅黑" w:hAnsi="微软雅黑"/>
@@ -12570,37 +14201,16 @@
           <w:b/>
           <w:bCs/>
         </w:rPr>
-        <w:t xml:space="preserve">替代方案五：部署方式替代</w:t>
-      </w:r>
-    </w:p>
-    <w:p>
-      <w:pPr>
-        <w:spacing w:line="276" w:lineRule="auto"/>
-        <w:rPr>
-          <w:rFonts w:ascii="微软雅黑" w:eastAsia="微软雅黑" w:hAnsi="微软雅黑"/>
-          <w:sz w:val="18"/>
-          <w:szCs w:val="18"/>
-        </w:rPr>
-        <w:ind w:firstLineChars="200" w:firstLine="420"/>
-      </w:pPr>
-      <w:r>
-        <w:rPr>
-          <w:rFonts w:ascii="微软雅黑" w:eastAsia="微软雅黑" w:hAnsi="微软雅黑"/>
-          <w:sz w:val="18"/>
-          <w:szCs w:val="18"/>
-        </w:rPr>
-        <w:t xml:space="preserve">可离线批处理执行，也可部署为在线推理质量闸门；可单机执行，也可在分布式任务调度框架上横向扩展，以适配大规模资产处理场景。</w:t>
-      </w:r>
-    </w:p>
-    <w:p>
-      <w:pPr>
-        <w:spacing w:line="276" w:lineRule="auto"/>
-        <w:rPr>
-          <w:rFonts w:ascii="微软雅黑" w:eastAsia="微软雅黑" w:hAnsi="微软雅黑"/>
-          <w:sz w:val="18"/>
-          <w:szCs w:val="18"/>
-        </w:rPr>
-      </w:pPr>
+        <w:t xml:space="preserve">骨骼驱动冲突指标</w:t>
+      </w:r>
+      <w:r>
+        <w:rPr>
+          <w:rFonts w:ascii="微软雅黑" w:eastAsia="微软雅黑" w:hAnsi="微软雅黑"/>
+          <w:sz w:val="18"/>
+          <w:szCs w:val="18"/>
+        </w:rPr>
+        <w:t xml:space="preserve">——同一骨骼或关节受多个驱动源（IK/FK/物理）作用时产生的目标残差或受力方向分歧大小，衡量驱动目标是否相互矛盾；</w:t>
+      </w:r>
       <w:r>
         <w:rPr>
           <w:rFonts w:ascii="微软雅黑" w:eastAsia="微软雅黑" w:hAnsi="微软雅黑"/>
@@ -12609,6 +14219,148 @@
           <w:b/>
           <w:bCs/>
         </w:rPr>
+        <w:t xml:space="preserve">碰撞持续时长指标</w:t>
+      </w:r>
+      <w:r>
+        <w:rPr>
+          <w:rFonts w:ascii="微软雅黑" w:eastAsia="微软雅黑" w:hAnsi="微软雅黑"/>
+          <w:sz w:val="18"/>
+          <w:szCs w:val="18"/>
+        </w:rPr>
+        <w:t xml:space="preserve">——动画序列（或滑动窗口）中穿插/碰撞发生的累计帧数、最长连续穿模帧数或时间占比，衡量穿模的持续程度。</w:t>
+      </w:r>
+    </w:p>
+    <w:p>
+      <w:pPr>
+        <w:spacing w:line="276" w:lineRule="auto"/>
+        <w:rPr>
+          <w:rFonts w:ascii="微软雅黑" w:eastAsia="微软雅黑" w:hAnsi="微软雅黑"/>
+          <w:sz w:val="18"/>
+          <w:szCs w:val="18"/>
+        </w:rPr>
+      </w:pPr>
+      <w:r>
+        <w:rPr>
+          <w:rFonts w:ascii="微软雅黑" w:eastAsia="微软雅黑" w:hAnsi="微软雅黑"/>
+          <w:sz w:val="18"/>
+          <w:szCs w:val="18"/>
+          <w:b/>
+          <w:bCs/>
+        </w:rPr>
+        <w:t xml:space="preserve">替代方案四：闭环动作替代</w:t>
+      </w:r>
+    </w:p>
+    <w:p>
+      <w:pPr>
+        <w:spacing w:line="276" w:lineRule="auto"/>
+        <w:rPr>
+          <w:rFonts w:ascii="微软雅黑" w:eastAsia="微软雅黑" w:hAnsi="微软雅黑"/>
+          <w:sz w:val="18"/>
+          <w:szCs w:val="18"/>
+        </w:rPr>
+        <w:ind w:firstLineChars="200" w:firstLine="420"/>
+      </w:pPr>
+      <w:r>
+        <w:rPr>
+          <w:rFonts w:ascii="微软雅黑" w:eastAsia="微软雅黑" w:hAnsi="微软雅黑"/>
+          <w:sz w:val="18"/>
+          <w:szCs w:val="18"/>
+        </w:rPr>
+        <w:t xml:space="preserve">"剔除"动作可替换为"修复任务自动派发"（触发下游自动化后处理算子），"降权"动作可替换为"课程式采样权重调度"，以适配不同训练框架的数据加载策略。其中"课程式采样权重调度"指在训练/评估过程中依据预设进度（epoch / step / 难度）动态改变各样本被抽取参与计算的概率权重，使系统先学简单样本、后学困难样本，并等价实现对"不重要/噪声动作"的阶段性降权——其所替换的正是本申请 §3.2.6"样本路由"中的降权系数 </w:t>
+      </w:r>
+      <m:oMath>
+        <m:box>
+          <m:e>
+            <m:sSub>
+              <m:e>
+                <m:r>
+                  <m:rPr>
+                    <m:sty m:val="i"/>
+                  </m:rPr>
+                  <m:t>w</m:t>
+                </m:r>
+              </m:e>
+              <m:sub>
+                <m:box>
+                  <m:e>
+                    <m:r>
+                      <m:rPr>
+                        <m:nor/>
+                      </m:rPr>
+                      <m:t>sample</m:t>
+                    </m:r>
+                  </m:e>
+                </m:box>
+              </m:sub>
+            </m:sSub>
+          </m:e>
+        </m:box>
+      </m:oMath>
+      <w:r>
+        <w:rPr>
+          <w:rFonts w:ascii="微软雅黑" w:eastAsia="微软雅黑" w:hAnsi="微软雅黑"/>
+          <w:sz w:val="18"/>
+          <w:szCs w:val="18"/>
+        </w:rPr>
+        <w:t xml:space="preserve">：原方案对B级样本施加一次性静态降权，替代方案则把该降权系数改为随训练进度动态调度的形式，二者作用对象（同一批样本的损失权重）一致，区别仅在权重是静态还是随进度变化。</w:t>
+      </w:r>
+    </w:p>
+    <w:p>
+      <w:pPr>
+        <w:spacing w:line="276" w:lineRule="auto"/>
+        <w:rPr>
+          <w:rFonts w:ascii="微软雅黑" w:eastAsia="微软雅黑" w:hAnsi="微软雅黑"/>
+          <w:sz w:val="18"/>
+          <w:szCs w:val="18"/>
+        </w:rPr>
+      </w:pPr>
+      <w:r>
+        <w:rPr>
+          <w:rFonts w:ascii="微软雅黑" w:eastAsia="微软雅黑" w:hAnsi="微软雅黑"/>
+          <w:sz w:val="18"/>
+          <w:szCs w:val="18"/>
+          <w:b/>
+          <w:bCs/>
+        </w:rPr>
+        <w:t xml:space="preserve">替代方案五：部署方式替代</w:t>
+      </w:r>
+    </w:p>
+    <w:p>
+      <w:pPr>
+        <w:spacing w:line="276" w:lineRule="auto"/>
+        <w:rPr>
+          <w:rFonts w:ascii="微软雅黑" w:eastAsia="微软雅黑" w:hAnsi="微软雅黑"/>
+          <w:sz w:val="18"/>
+          <w:szCs w:val="18"/>
+        </w:rPr>
+        <w:ind w:firstLineChars="200" w:firstLine="420"/>
+      </w:pPr>
+      <w:r>
+        <w:rPr>
+          <w:rFonts w:ascii="微软雅黑" w:eastAsia="微软雅黑" w:hAnsi="微软雅黑"/>
+          <w:sz w:val="18"/>
+          <w:szCs w:val="18"/>
+        </w:rPr>
+        <w:t xml:space="preserve">可离线批处理执行，也可部署为在线推理质量闸门；可单机执行，也可在分布式任务调度框架上横向扩展，以适配大规模资产处理场景。</w:t>
+      </w:r>
+    </w:p>
+    <w:p>
+      <w:pPr>
+        <w:spacing w:line="276" w:lineRule="auto"/>
+        <w:rPr>
+          <w:rFonts w:ascii="微软雅黑" w:eastAsia="微软雅黑" w:hAnsi="微软雅黑"/>
+          <w:sz w:val="18"/>
+          <w:szCs w:val="18"/>
+        </w:rPr>
+      </w:pPr>
+      <w:r>
+        <w:rPr>
+          <w:rFonts w:ascii="微软雅黑" w:eastAsia="微软雅黑" w:hAnsi="微软雅黑"/>
+          <w:sz w:val="18"/>
+          <w:szCs w:val="18"/>
+          <w:b/>
+          <w:bCs/>
+        </w:rPr>
         <w:t xml:space="preserve">替代方案六：反馈源替代</w:t>
       </w:r>
     </w:p>
@@ -12628,7 +14380,61 @@
           <w:sz w:val="18"/>
           <w:szCs w:val="18"/>
         </w:rPr>
-        <w:t xml:space="preserve">除训练回归结果外，还可接入用户编辑日志（如美术手动修复记录）、线上异常报警或A/B测试用户反馈作为补充质量信号，进一步丰富闭环反馈来源。</w:t>
+        <w:t xml:space="preserve">除训练回归结果外，还可接入用户编辑日志、线上异常报警或A/B测试用户反馈作为补充质量信号，进一步丰富闭环反馈来源。各示例的具体含义为：</w:t>
+      </w:r>
+      <w:r>
+        <w:rPr>
+          <w:rFonts w:ascii="微软雅黑" w:eastAsia="微软雅黑" w:hAnsi="微软雅黑"/>
+          <w:sz w:val="18"/>
+          <w:szCs w:val="18"/>
+          <w:b/>
+          <w:bCs/>
+        </w:rPr>
+        <w:t xml:space="preserve">用户编辑日志</w:t>
+      </w:r>
+      <w:r>
+        <w:rPr>
+          <w:rFonts w:ascii="微软雅黑" w:eastAsia="微软雅黑" w:hAnsi="微软雅黑"/>
+          <w:sz w:val="18"/>
+          <w:szCs w:val="18"/>
+        </w:rPr>
+        <w:t xml:space="preserve">指美术在生产工具中对蒙皮结果的手动修复记录（如手动重刷某区域权重、手动剔除某帧），可作为"该区域确为异常"的强信号反馈到评估阈值校准；</w:t>
+      </w:r>
+      <w:r>
+        <w:rPr>
+          <w:rFonts w:ascii="微软雅黑" w:eastAsia="微软雅黑" w:hAnsi="微软雅黑"/>
+          <w:sz w:val="18"/>
+          <w:szCs w:val="18"/>
+          <w:b/>
+          <w:bCs/>
+        </w:rPr>
+        <w:t xml:space="preserve">线上异常报警</w:t>
+      </w:r>
+      <w:r>
+        <w:rPr>
+          <w:rFonts w:ascii="微软雅黑" w:eastAsia="微软雅黑" w:hAnsi="微软雅黑"/>
+          <w:sz w:val="18"/>
+          <w:szCs w:val="18"/>
+        </w:rPr>
+        <w:t xml:space="preserve">指模型部署后运行时触发的穿模/抖动告警，可回流为新的难例；</w:t>
+      </w:r>
+      <w:r>
+        <w:rPr>
+          <w:rFonts w:ascii="微软雅黑" w:eastAsia="微软雅黑" w:hAnsi="微软雅黑"/>
+          <w:sz w:val="18"/>
+          <w:szCs w:val="18"/>
+          <w:b/>
+          <w:bCs/>
+        </w:rPr>
+        <w:t xml:space="preserve">A/B测试用户反馈</w:t>
+      </w:r>
+      <w:r>
+        <w:rPr>
+          <w:rFonts w:ascii="微软雅黑" w:eastAsia="微软雅黑" w:hAnsi="微软雅黑"/>
+          <w:sz w:val="18"/>
+          <w:szCs w:val="18"/>
+        </w:rPr>
+        <w:t xml:space="preserve">指对不同蒙皮模型版本所产结果的用户主观评分或留存对比，可作为版本回归之外的额外质量裁决依据。</w:t>
       </w:r>
     </w:p>
     <w:p>

</xml_diff>